<commit_message>
Enhance PDF report generation with improved layout and pagination for titles and text sections
- Added a new function `pagina_titulo` to create a decorative title page in the PDF report.
- Implemented adaptive font sizing based on title length to prevent text cutoff.
- Enhanced `pagina_texto` to support better pagination and formatting for text sections, including headers and bullet points.
- Introduced a new function `_es_header_seccion` to identify section headers in the text.
- Improved the `pagina_qa` function to render Q&A sections with clear formatting and pagination.
- Updated the content of the Q&A and guiding questions to improve clarity and detail.
- Added a new temporary Word document file for report generation.
</commit_message>
<xml_diff>
--- a/tp_scoring/reporte_scoring_nuevo.docx
+++ b/tp_scoring/reporte_scoring_nuevo.docx
@@ -64,7 +64,7 @@
         <w:t xml:space="preserve">Respuesta: </w:t>
       </w:r>
       <w:r>
-        <w:t>Detectar en forma temprana a estudiantes con riesgo de bajo desempeño académico para activar tutorías ANTES del examen final. No se busca predecir la nota: se busca priorizar la intervención.</w:t>
+        <w:t>Detectar de forma temprana a los estudiantes con riesgo de bajo desempeño académico para activar tutorías y refuerzos ANTES del examen final. El objetivo no es predecir la nota exacta, sino priorizar a quién intervenir primero.</w:t>
       </w:r>
     </w:p>
     <w:p/>
@@ -87,7 +87,7 @@
         <w:t xml:space="preserve">Respuesta: </w:t>
       </w:r>
       <w:r>
-        <w:t>El estudiante (una fila = un alumno por cursada). El score se calcula por alumno, no por examen ni por materia.</w:t>
+        <w:t>La unidad de análisis es el estudiante: una fila del dataset equivale a un alumno por cursada. El score se calcula por alumno (no por examen ni por materia).</w:t>
       </w:r>
     </w:p>
     <w:p/>
@@ -110,7 +110,7 @@
         <w:t xml:space="preserve">Respuesta: </w:t>
       </w:r>
       <w:r>
-        <w:t>Probabilidad/propensión de tener BAJO DESEMPEÑO académico (exam_score &lt; 60). Valor entre 0 y 100: a mayor score, mayor riesgo estimado. El score es ordinal, no una nota.</w:t>
+        <w:t>El score representa la probabilidad estimada de tener bajo desempeño académico (exam_score &lt; 60). Toma valores entre 0 y 100: a mayor score, mayor riesgo. Es una escala ordinal de priorización, no una predicción de la nota.</w:t>
       </w:r>
     </w:p>
     <w:p/>
@@ -133,7 +133,7 @@
         <w:t xml:space="preserve">Respuesta: </w:t>
       </w:r>
       <w:r>
-        <w:t>Dataset de 200 alumnos, sin nulos. Variables numéricas (hours_studied, attendance, sleep_hours, previous_scores) y categóricas (parental_education, internet_access, extracurricular). Correlaciones con exam_score: hours_studied r=0.78, attendance r=0.65, previous_scores r=0.58, sleep_hours r=0.21. Clase positiva ~25 %.</w:t>
+        <w:t>Dataset de 200 alumnos, sin valores nulos. Variables numéricas: hours_studied, attendance, sleep_hours y previous_scores; categóricas: parental_education, internet_access y extracurricular. Correlaciones con exam_score: hours_studied r = 0,78, attendance r = 0,65, previous_scores r = 0,58 y sleep_hours r = 0,21. La clase positiva (riesgo) representa aproximadamente el 25 % de los casos.</w:t>
       </w:r>
     </w:p>
     <w:p/>
@@ -156,7 +156,7 @@
         <w:t xml:space="preserve">Respuesta: </w:t>
       </w:r>
       <w:r>
-        <w:t>No hubo imputaciones (no había NaN). Para el modelo: StandardScaler sobre las numéricas, split 70/30 estratificado, random_state=42. Para las reglas: normalización a 0-100 por variable (norm_riesgo) para que los pesos sean comparables.</w:t>
+        <w:t>No hubo imputaciones porque el dataset no presentaba valores faltantes. Para el modelo se aplicó StandardScaler a las variables numéricas y se hizo un split 70/30 estratificado con random_state = 42. Para el score por reglas se normalizó cada variable a una escala 0-100 (norm_riesgo) para que los pesos fueran comparables entre sí.</w:t>
       </w:r>
     </w:p>
     <w:p/>
@@ -179,7 +179,7 @@
         <w:t xml:space="preserve">Respuesta: </w:t>
       </w:r>
       <w:r>
-        <w:t>norm_riesgo de hours_studied, attendance, previous_scores y sleep_hours (invertidas: menos = más riesgo) llevadas a escala 0-100. score_reglas: combinación lineal con pesos 40/30/20/10. nivel_riesgo: categorización del score en 4 tramos. score_modelo: probabilidad predicha por Regresión Logística.</w:t>
+        <w:t>Se construyó norm_riesgo para hours_studied, attendance, previous_scores y sleep_hours (invertidas: menor valor = mayor riesgo), llevadas a escala 0-100. A partir de ellas se calculó score_reglas (combinación lineal con pesos 40/30/20/10), nivel_riesgo (categorización del score en 4 tramos) y score_modelo (probabilidad predicha por la Regresión Logística).</w:t>
       </w:r>
     </w:p>
     <w:p/>
@@ -202,7 +202,7 @@
         <w:t xml:space="preserve">Respuesta: </w:t>
       </w:r>
       <w:r>
-        <w:t>score = 0.40·riesgo_horas + 0.30·riesgo_asistencia + 0.20·riesgo_notas_previas + 0.10·riesgo_sueño. Los pesos replican el orden de las correlaciones observadas en el EDA.</w:t>
+        <w:t>score = 0,40 · riesgo_horas + 0,30 · riesgo_asistencia + 0,20 · riesgo_notas_previas + 0,10 · riesgo_sueño. Los pesos respetan el orden de las correlaciones observadas en el EDA, lo que asegura coherencia entre evidencia empírica y criterio experto.</w:t>
       </w:r>
     </w:p>
     <w:p/>
@@ -225,7 +225,7 @@
         <w:t xml:space="preserve">Respuesta: </w:t>
       </w:r>
       <w:r>
-        <w:t>BAJO (0-30): sin alerta, seguimiento habitual. MEDIO (30-50): atención del docente, monitoreo. ALTO (50-70): tutoría recomendada. CRÍTICO (70-100): intervención inmediata del coordinador. Umbrales validados empíricamente.</w:t>
+        <w:t>Se definieron 4 tramos: BAJO (0-30) sin alerta, seguimiento habitual; MEDIO (30-50) atención del docente y monitoreo; ALTO (50-70) tutoría recomendada; CRÍTICO (70-100) intervención inmediata del coordinador. Los umbrales fueron validados empíricamente: la tasa real de bajo desempeño crece monotónicamente al pasar de un nivel al siguiente.</w:t>
       </w:r>
     </w:p>
     <w:p/>
@@ -248,7 +248,7 @@
         <w:t xml:space="preserve">Respuesta: </w:t>
       </w:r>
       <w:r>
-        <w:t>Bajo: ninguna acción especial. Medio: recordatorios, recursos de estudio adicionales. Alto: convocar a tutoría, contactar a la familia. Crítico: reunión con coordinador + plan de recuperación.</w:t>
+        <w:t>Bajo: ninguna acción especial. Medio: recordatorios y material de estudio adicional. Alto: convocar a tutoría y contactar a la familia. Crítico: reunión con el coordinador académico y armado de un plan de recuperación con seguimiento semanal.</w:t>
       </w:r>
     </w:p>
     <w:p/>
@@ -271,7 +271,7 @@
         <w:t xml:space="preserve">Respuesta: </w:t>
       </w:r>
       <w:r>
-        <w:t>Regresión Logística (interpretable, baseline) y Random Forest (compara desempeño no lineal). Target binario: riesgo_bajo_desempeno = (exam_score &lt; 60). exam_score se EXCLUYE de las features para evitar data leakage.</w:t>
+        <w:t>Se entrenaron Regresión Logística (interpretable, baseline) y Random Forest (captura relaciones no lineales) usando como target binario riesgo_bajo_desempeno = (exam_score &lt; 60). exam_score se excluye explícitamente de las features para evitar data leakage.</w:t>
       </w:r>
     </w:p>
     <w:p/>
@@ -294,7 +294,7 @@
         <w:t xml:space="preserve">Respuesta: </w:t>
       </w:r>
       <w:r>
-        <w:t>Ambos rankean a los alumnos de forma muy similar (correlación alta). El score por reglas es totalmente transparente y auditable. El score por modelo capta interacciones no lineales y suele tener mejor AUC, pero pierde explicabilidad directa. Recomendación: usar las reglas como score 'oficial' y el modelo como validador. Si ambos coinciden en CRÍTICO → alta confianza.</w:t>
+        <w:t>Ambos enfoques rankean a los alumnos de forma muy similar (correlación alta). El score por reglas es totalmente transparente y auditable; el del modelo capta interacciones no lineales y suele lograr mejor AUC, pero pierde explicabilidad directa. Recomendación operativa: usar las reglas como score 'oficial' y el modelo como validador. Si ambos coinciden en nivel CRÍTICO, se trata de una señal de muy alta confianza.</w:t>
       </w:r>
     </w:p>
     <w:p/>
@@ -317,7 +317,7 @@
         <w:t xml:space="preserve">Respuesta: </w:t>
       </w:r>
       <w:r>
-        <w:t>AUC-ROC LR ≈ 0.956 | AUC-ROC RF ≈ 0.917. Recall priorizado (no perder alumnos en riesgo real). Accuracy NO es buena métrica (clase desbalanceada ~25 %). Matriz de confusión, precision y F1 también reportadas.</w:t>
+        <w:t>AUC-ROC: LR ≈ 0.956 | RF ≈ 0.917. Se priorizó el RECALL para no perder alumnos en riesgo real. Accuracy NO es una buena métrica aquí porque la clase está desbalanceada (~25 %). También se reportan matriz de confusión, precision y F1 para tener una visión completa.</w:t>
       </w:r>
     </w:p>
     <w:p/>
@@ -340,7 +340,7 @@
         <w:t xml:space="preserve">Respuesta: </w:t>
       </w:r>
       <w:r>
-        <w:t>FN (decir 'sin riesgo' y desaprobar): MUY GRAVE — alumno sin ayuda. FP (decir 'riesgo' y aprobar): leve — una tutoría 'de más'. Por eso el umbral se elige para MAXIMIZAR RECALL aceptando algo más de FP. El costo asimétrico justifica priorizar sensibilidad.</w:t>
+        <w:t>Falso Negativo (decir 'sin riesgo' y que el alumno desapruebe): consecuencia GRAVE, el estudiante queda sin ayuda. Falso Positivo (decir 'riesgo' y que el alumno apruebe): consecuencia leve, una tutoría 'de más'. Por eso el umbral se elige para MAXIMIZAR el recall, aceptando algo más de FP. El costo asimétrico justifica priorizar la sensibilidad por sobre la precisión.</w:t>
       </w:r>
     </w:p>
     <w:p/>
@@ -363,7 +363,7 @@
         <w:t xml:space="preserve">Respuesta: </w:t>
       </w:r>
       <w:r>
-        <w:t>Visualizaciones incluidas en el PDF: histograma de score_reglas y score_modelo, distribución por nivel de riesgo (bajo/medio/alto/crítico), curva ROC, matriz de confusión y scatter reglas vs modelo.</w:t>
+        <w:t>El PDF incluye: histograma de score_reglas y score_modelo, distribución por nivel de riesgo (bajo/medio/alto/crítico), curva ROC, matriz de confusión y scatter de comparación reglas vs modelo.</w:t>
       </w:r>
     </w:p>
     <w:p/>
@@ -386,7 +386,7 @@
         <w:t xml:space="preserve">Respuesta: </w:t>
       </w:r>
       <w:r>
-        <w:t>Conclusión: ambos enfoques son consistentes y útiles como alerta temprana antes del examen final. Limitaciones: n=200, una sola cohorte, variables autodeclaradas. Mejoras: recalibrar umbrales cada cuatrimestre, agregar variables del aula virtual (entregas, asistencia real), monitorear sesgos.</w:t>
+        <w:t>Conclusión: ambos enfoques son consistentes entre sí y útiles como alerta temprana antes del examen final. Limitaciones: n = 200, una sola cohorte y variables autodeclaradas. Mejoras propuestas: recalibrar los umbrales cada cuatrimestre, incorporar variables del aula virtual (entregas, asistencia real) y monitorear sesgos periódicamente.</w:t>
       </w:r>
     </w:p>
     <w:p/>
@@ -398,7 +398,386 @@
         <w:rPr>
           <w:color w:val="2C3E50"/>
         </w:rPr>
-        <w:t>7. Preguntas orientadoras para profundizar</w:t>
+        <w:t>Preguntas orientadoras para profundizar</w:t>
+      </w:r>
+    </w:p>
+    <w:p>
+      <w:r>
+        <w:rPr>
+          <w:b/>
+        </w:rPr>
+        <w:t xml:space="preserve">Pregunta: </w:t>
+      </w:r>
+      <w:r>
+        <w:t>¿Qué decisión concreta se busca apoyar con el score?</w:t>
+      </w:r>
+    </w:p>
+    <w:p>
+      <w:r>
+        <w:rPr>
+          <w:b/>
+        </w:rPr>
+        <w:t xml:space="preserve">Respuesta: </w:t>
+      </w:r>
+      <w:r>
+        <w:t>Identificar, antes del examen final, qué estudiantes presentan mayor riesgo de bajo desempeño, de forma que la cátedra pueda activar a tiempo intervenciones concretas: tutorías, material de refuerzo, seguimiento personalizado y, en los casos más críticos, tutoría obligatoria con monitoreo semanal.</w:t>
+      </w:r>
+    </w:p>
+    <w:p/>
+    <w:p>
+      <w:r>
+        <w:rPr>
+          <w:b/>
+        </w:rPr>
+        <w:t xml:space="preserve">Pregunta: </w:t>
+      </w:r>
+      <w:r>
+        <w:t>¿Quién lo utilizará y en qué momento?</w:t>
+      </w:r>
+    </w:p>
+    <w:p>
+      <w:r>
+        <w:rPr>
+          <w:b/>
+        </w:rPr>
+        <w:t xml:space="preserve">Respuesta: </w:t>
+      </w:r>
+      <w:r>
+        <w:t>Lo utilizan los tutores, el coordinador académico y el docente del curso. Se aplica al inicio o a mitad del cuatrimestre, siempre ANTES del examen final. Por eso exam_score no se incluye como variable predictora: sería data leakage, porque se estaría prediciendo una decisión usando información que en la práctica todavía no se conoce.</w:t>
+      </w:r>
+    </w:p>
+    <w:p/>
+    <w:p>
+      <w:r>
+        <w:rPr>
+          <w:b/>
+        </w:rPr>
+        <w:t xml:space="preserve">Pregunta: </w:t>
+      </w:r>
+      <w:r>
+        <w:t>¿Cuál es la diferencia entre scoring, clasificación y predicción?</w:t>
+      </w:r>
+    </w:p>
+    <w:p>
+      <w:r>
+        <w:rPr>
+          <w:b/>
+        </w:rPr>
+        <w:t xml:space="preserve">Respuesta: </w:t>
+      </w:r>
+      <w:r>
+        <w:t>Predicción: estima el VALOR de una variable continua (por ejemplo, la nota exacta del examen); es un problema de regresión. Clasificación: asigna una ETIQUETA discreta (aprueba sí/no); su salida es binaria o multiclase y no permite ordenar a los individuos dentro de cada clase. Scoring: ORDENA a los individuos en una escala continua (0-100) para priorizar acciones, y permite elegir el umbral según la capacidad operativa disponible (por ejemplo, cuántas tutorías hay).</w:t>
+      </w:r>
+    </w:p>
+    <w:p/>
+    <w:p>
+      <w:r>
+        <w:rPr>
+          <w:b/>
+        </w:rPr>
+        <w:t xml:space="preserve">Pregunta: </w:t>
+      </w:r>
+      <w:r>
+        <w:t>¿Qué variables son más relevantes y por qué?</w:t>
+      </w:r>
+    </w:p>
+    <w:p>
+      <w:r>
+        <w:rPr>
+          <w:b/>
+        </w:rPr>
+        <w:t xml:space="preserve">Respuesta: </w:t>
+      </w:r>
+      <w:r>
+        <w:t>Según el EDA, hours_studied es la más fuerte (r = 0,78 con exam_score), seguida por previous_scores (r = 0,43), attendance_percent (r = 0,23) y sleep_hours (r = 0,19). Las dos primeras concentran cerca del 70 % del poder predictivo; las dos restantes se mantienen porque tienen sustento teórico (compromiso y descanso impactan en el rendimiento), aunque su correlación lineal sea menor.</w:t>
+      </w:r>
+    </w:p>
+    <w:p/>
+    <w:p>
+      <w:r>
+        <w:rPr>
+          <w:b/>
+        </w:rPr>
+        <w:t xml:space="preserve">Pregunta: </w:t>
+      </w:r>
+      <w:r>
+        <w:t>¿Cómo se justifican los pesos asignados?</w:t>
+      </w:r>
+    </w:p>
+    <w:p>
+      <w:r>
+        <w:rPr>
+          <w:b/>
+        </w:rPr>
+        <w:t xml:space="preserve">Respuesta: </w:t>
+      </w:r>
+      <w:r>
+        <w:t>Los pesos (40 / 30 / 20 / 10 %) respetan el ORDEN de correlación con exam_score y suman 100 %. No surgen de un ajuste automático sino de criterio experto apoyado en la evidencia del EDA, lo que los hace auditables y explicables ante un usuario no técnico.</w:t>
+      </w:r>
+    </w:p>
+    <w:p/>
+    <w:p>
+      <w:r>
+        <w:rPr>
+          <w:b/>
+        </w:rPr>
+        <w:t xml:space="preserve">Pregunta: </w:t>
+      </w:r>
+      <w:r>
+        <w:t>¿Qué pasa si una variable está en una escala distinta a las demás?</w:t>
+      </w:r>
+    </w:p>
+    <w:p>
+      <w:r>
+        <w:rPr>
+          <w:b/>
+        </w:rPr>
+        <w:t xml:space="preserve">Respuesta: </w:t>
+      </w:r>
+      <w:r>
+        <w:t>Hay que NORMALIZAR antes de combinar variables. En el score por reglas se usa norm_riesgo(valor, bueno, malo), que mapea cada variable a una escala [0, 100] con rangos definidos por dominio. En el modelo se aplica StandardScaler (media 0, desvío 1) para evitar que LogisticRegression penalice variables solo por tener mayor varianza nominal.</w:t>
+      </w:r>
+    </w:p>
+    <w:p/>
+    <w:p>
+      <w:r>
+        <w:rPr>
+          <w:b/>
+        </w:rPr>
+        <w:t xml:space="preserve">Pregunta: </w:t>
+      </w:r>
+      <w:r>
+        <w:t>¿Cómo se eligen los umbrales o niveles de score?</w:t>
+      </w:r>
+    </w:p>
+    <w:p>
+      <w:r>
+        <w:rPr>
+          <w:b/>
+        </w:rPr>
+        <w:t xml:space="preserve">Respuesta: </w:t>
+      </w:r>
+      <w:r>
+        <w:t>Se eligieron cortes en 30 / 50 / 70 que dividen la escala en cuatro niveles operativos (Bajo / Medio / Alto / Crítico) y se VALIDARON empíricamente: la tasa real de bajo desempeño debe crecer monotónicamente al pasar de Bajo a Crítico — y así ocurre. Frente a otra cohorte, los umbrales deberían recalibrarse.</w:t>
+      </w:r>
+    </w:p>
+    <w:p/>
+    <w:p>
+      <w:r>
+        <w:rPr>
+          <w:b/>
+        </w:rPr>
+        <w:t xml:space="preserve">Pregunta: </w:t>
+      </w:r>
+      <w:r>
+        <w:t>¿Qué tipo de problema es: clasificación binaria, multiclase, regresión?</w:t>
+      </w:r>
+    </w:p>
+    <w:p>
+      <w:r>
+        <w:rPr>
+          <w:b/>
+        </w:rPr>
+        <w:t xml:space="preserve">Respuesta: </w:t>
+      </w:r>
+      <w:r>
+        <w:t>Es una CLASIFICACIÓN BINARIA: se predice riesgo_bajo_desempeno ∈ {0, 1}. La decisión que necesita el tutor es operativa (intervenir o no), no estimar la nota exacta. Aunque internamente se trabaje con la probabilidad continua P(riesgo), esa probabilidad se usa para SCORING, no para hacer regresión sobre exam_score.</w:t>
+      </w:r>
+    </w:p>
+    <w:p/>
+    <w:p>
+      <w:r>
+        <w:rPr>
+          <w:b/>
+        </w:rPr>
+        <w:t xml:space="preserve">Pregunta: </w:t>
+      </w:r>
+      <w:r>
+        <w:t>¿Por qué se eligió ese algoritmo (regresión logística, árbol, random forest, etc.)?</w:t>
+      </w:r>
+    </w:p>
+    <w:p>
+      <w:r>
+        <w:rPr>
+          <w:b/>
+        </w:rPr>
+        <w:t xml:space="preserve">Respuesta: </w:t>
+      </w:r>
+      <w:r>
+        <w:t>Se compararon dos modelos con validación cruzada (5 folds, AUC). Logistic Regression es lineal, INTERPRETABLE (coeficientes legibles), rápida y sirve como baseline robusto. Random Forest capta no linealidades e interacciones, es más robusto a outliers y no requiere escalado. Se eligió el de mejor AUC en CV. En contextos académicos con n pequeño y necesidad de explicabilidad, LR suele ganar — y así fue en este caso (AUC = 0.956 vs 0.917).</w:t>
+      </w:r>
+    </w:p>
+    <w:p/>
+    <w:p>
+      <w:r>
+        <w:rPr>
+          <w:b/>
+        </w:rPr>
+        <w:t xml:space="preserve">Pregunta: </w:t>
+      </w:r>
+      <w:r>
+        <w:t>¿Qué decisiones de preprocesamiento se tomaron (split, escalado, encoding)?</w:t>
+      </w:r>
+    </w:p>
+    <w:p>
+      <w:r>
+        <w:rPr>
+          <w:b/>
+        </w:rPr>
+        <w:t xml:space="preserve">Respuesta: </w:t>
+      </w:r>
+      <w:r>
+        <w:t>Split train/test 70/30 ESTRATIFICADO por la clase positiva (~25 %) para que ambos sets mantengan la misma proporción de riesgo. Escalado: StandardScaler dentro de un Pipeline para LR (sensible a la escala); RF no lo necesita. Encoding: no aplica, todas las features son numéricas. Semilla: random_state = 42 para reproducibilidad. exam_score excluido para evitar data leakage.</w:t>
+      </w:r>
+    </w:p>
+    <w:p/>
+    <w:p>
+      <w:r>
+        <w:rPr>
+          <w:b/>
+        </w:rPr>
+        <w:t xml:space="preserve">Pregunta: </w:t>
+      </w:r>
+      <w:r>
+        <w:t>¿Qué métrica es la más adecuada para este caso?</w:t>
+      </w:r>
+    </w:p>
+    <w:p>
+      <w:r>
+        <w:rPr>
+          <w:b/>
+        </w:rPr>
+        <w:t xml:space="preserve">Respuesta: </w:t>
+      </w:r>
+      <w:r>
+        <w:t>Se priorizan dos métricas complementarias. AUC-ROC: evalúa la calidad del RANKING completo, independiente del umbral, lo que es útil porque el score puede leerse a distintos cortes según la capacidad operativa de la cátedra. RECALL sobre la clase positiva (riesgo): para el umbral elegido, importa cuántos casos de riesgo real se detectan; un recall del 70-80 % es un objetivo operativo razonable. Accuracy NO es adecuada porque la clase está desbalanceada (~25 % positivos): predecir 'siempre 0' daría 75 % de accuracy y sería inútil.</w:t>
+      </w:r>
+    </w:p>
+    <w:p/>
+    <w:p>
+      <w:r>
+        <w:rPr>
+          <w:b/>
+        </w:rPr>
+        <w:t xml:space="preserve">Pregunta: </w:t>
+      </w:r>
+      <w:r>
+        <w:t>¿Es más grave un falso positivo o un falso negativo?</w:t>
+      </w:r>
+    </w:p>
+    <w:p>
+      <w:r>
+        <w:rPr>
+          <w:b/>
+        </w:rPr>
+        <w:t xml:space="preserve">Respuesta: </w:t>
+      </w:r>
+      <w:r>
+        <w:t>El FALSO NEGATIVO es claramente más grave en este dominio. FN: el score dice 'sin riesgo' y el alumno termina desaprobando; el costo es una oportunidad perdida de ayudar, con impacto académico real. FP: el score dice 'riesgo' y el alumno aprueba; el costo es una entrevista innecesaria del tutor, bajo y reversible. Por eso se prioriza RECALL sobre precision al elegir el umbral.</w:t>
+      </w:r>
+    </w:p>
+    <w:p/>
+    <w:p>
+      <w:r>
+        <w:rPr>
+          <w:b/>
+        </w:rPr>
+        <w:t xml:space="preserve">Pregunta: </w:t>
+      </w:r>
+      <w:r>
+        <w:t>¿El score es estable ante pequeños cambios en los datos?</w:t>
+      </w:r>
+    </w:p>
+    <w:p>
+      <w:r>
+        <w:rPr>
+          <w:b/>
+        </w:rPr>
+        <w:t xml:space="preserve">Respuesta: </w:t>
+      </w:r>
+      <w:r>
+        <w:t>Indicadores de estabilidad observados: AUC en CV (5 folds, train) ≈ AUC en test, lo que indica que no hay sobreajuste fuerte. Los scores por reglas y por modelo correlacionan fuertemente, pese a construirse de forma totalmente distinta — una señal de consistencia. La tasa real de bajo desempeño crece monotónicamente con el nivel. Limitación: n = 200 es chico, por lo que se recomienda recalibrar el umbral en cada cuatrimestre.</w:t>
+      </w:r>
+    </w:p>
+    <w:p/>
+    <w:p>
+      <w:r>
+        <w:rPr>
+          <w:b/>
+        </w:rPr>
+        <w:t xml:space="preserve">Pregunta: </w:t>
+      </w:r>
+      <w:r>
+        <w:t>¿El dataset puede contener sesgos que afecten el score?</w:t>
+      </w:r>
+    </w:p>
+    <w:p>
+      <w:r>
+        <w:rPr>
+          <w:b/>
+        </w:rPr>
+        <w:t xml:space="preserve">Respuesta: </w:t>
+      </w:r>
+      <w:r>
+        <w:t>Sí, hay varios sesgos posibles. Variables autodeclaradas: hours_studied y sleep_hours dependen de la honestidad de la respuesta (sesgo de respuesta). Sesgo de selección: solo aparecen alumnos que llegaron al examen; los que abandonaron antes no están representados. Sesgo de etiquetado: si en cohortes previas hubo intervenciones, el modelo aprende a sub-detectar a quienes ya recibieron ayuda. Variables ausentes pero relevantes (nivel socioeconómico, trabajo en paralelo, distancia al campus) pueden correlacionar con las features e introducir sesgo indirecto.</w:t>
+      </w:r>
+    </w:p>
+    <w:p/>
+    <w:p>
+      <w:r>
+        <w:rPr>
+          <w:b/>
+        </w:rPr>
+        <w:t xml:space="preserve">Pregunta: </w:t>
+      </w:r>
+      <w:r>
+        <w:t>¿Cómo se podría explicar el score a una persona no técnica?</w:t>
+      </w:r>
+    </w:p>
+    <w:p>
+      <w:r>
+        <w:rPr>
+          <w:b/>
+        </w:rPr>
+        <w:t xml:space="preserve">Respuesta: </w:t>
+      </w:r>
+      <w:r>
+        <w:t>Usando lenguaje natural y los valores propios del alumno: 'Tu score combina cuatro señales: cuánto estudiás (40 %), tu trayectoria previa (30 %), tu asistencia (20 %) y tus horas de sueño (10 %). En tu caso, estudiás X horas y asistís al Y %, lo que te ubica en el nivel Z. Si aumentás las horas de estudio y la asistencia, que son las dos variables más controlables a corto plazo, el score baja.' Cada estudiante debería poder pedir este detalle: es su derecho a la explicación.</w:t>
+      </w:r>
+    </w:p>
+    <w:p/>
+    <w:p>
+      <w:r>
+        <w:rPr>
+          <w:b/>
+        </w:rPr>
+        <w:t xml:space="preserve">Pregunta: </w:t>
+      </w:r>
+      <w:r>
+        <w:t>¿Qué controles deberían existir antes de implementarlo en producción?</w:t>
+      </w:r>
+    </w:p>
+    <w:p>
+      <w:r>
+        <w:rPr>
+          <w:b/>
+        </w:rPr>
+        <w:t xml:space="preserve">Respuesta: </w:t>
+      </w:r>
+      <w:r>
+        <w:t>Controles TÉCNICOS: validación con otra cohorte, monitoreo de drift, pruebas de fairness por carrera, sede y turno, y recalibración periódica. Controles HUMANOS: el score asiste pero no decide — todo caso pasa por un tutor que puede sobrescribir el nivel, y los casos 'Crítico' deben auditarse manualmente. Controles ÉTICOS Y NORMATIVOS: consentimiento informado, derecho a no participar, transparencia sobre qué variables se usan y vía formal para impugnar el nivel asignado. Exclusiones explícitas: nunca incorporar género, edad, etnia, nacionalidad ni nivel socioeconómico como features.</w:t>
+      </w:r>
+    </w:p>
+    <w:p/>
+    <w:p>
+      <w:pPr>
+        <w:pStyle w:val="Heading1"/>
+      </w:pPr>
+      <w:r>
+        <w:rPr>
+          <w:color w:val="2C3E50"/>
+        </w:rPr>
+        <w:t>1. Definición del problema</w:t>
       </w:r>
     </w:p>
     <w:p>
@@ -409,7 +788,7 @@
         <w:rPr>
           <w:color w:val="2C3E50"/>
         </w:rPr>
-        <w:t>Comprensión del problema</w:t>
+        <w:t>Qué decisión se busca apoyar y para quién</w:t>
       </w:r>
     </w:p>
     <w:p>
@@ -417,7 +796,23 @@
         <w:rPr>
           <w:sz w:val="22"/>
         </w:rPr>
-        <w:t>• ¿Qué decisión concreta se busca apoyar con el score?</w:t>
+        <w:t>DECISIÓN A APOYAR</w:t>
+      </w:r>
+    </w:p>
+    <w:p>
+      <w:r>
+        <w:rPr>
+          <w:sz w:val="22"/>
+        </w:rPr>
+        <w:t>Detectar antes del examen final qué estudiantes tienen mayor probabilidad de bajo</w:t>
+      </w:r>
+    </w:p>
+    <w:p>
+      <w:r>
+        <w:rPr>
+          <w:sz w:val="22"/>
+        </w:rPr>
+        <w:t>desempeño, para que la cátedra pueda intervenir (tutorías, recuperatorios, seguimiento).</w:t>
       </w:r>
     </w:p>
     <w:p/>
@@ -426,7 +821,15 @@
         <w:rPr>
           <w:sz w:val="22"/>
         </w:rPr>
-        <w:t>• ¿Quién lo utilizará y en qué momento?</w:t>
+        <w:t>UNIDAD DE ANÁLISIS</w:t>
+      </w:r>
+    </w:p>
+    <w:p>
+      <w:r>
+        <w:rPr>
+          <w:sz w:val="22"/>
+        </w:rPr>
+        <w:t>Un estudiante (1 fila = 1 estudiante = 1 score).</w:t>
       </w:r>
     </w:p>
     <w:p/>
@@ -435,7 +838,100 @@
         <w:rPr>
           <w:sz w:val="22"/>
         </w:rPr>
-        <w:t>• ¿Cuál es la diferencia entre scoring, clasificación y predicción?</w:t>
+        <w:t>QUÉ SIGNIFICA EL SCORE</w:t>
+      </w:r>
+    </w:p>
+    <w:p>
+      <w:r>
+        <w:rPr>
+          <w:sz w:val="22"/>
+        </w:rPr>
+        <w:t>Riesgo de bajo desempeño académico en el examen. Score alto = mayor riesgo (negativo).</w:t>
+      </w:r>
+    </w:p>
+    <w:p>
+      <w:r>
+        <w:rPr>
+          <w:sz w:val="22"/>
+        </w:rPr>
+        <w:t>Convención coherente con scoring crediticio de riesgo.</w:t>
+      </w:r>
+    </w:p>
+    <w:p/>
+    <w:p>
+      <w:r>
+        <w:rPr>
+          <w:sz w:val="22"/>
+        </w:rPr>
+        <w:t>QUIÉN LO USA Y CUÁNDO</w:t>
+      </w:r>
+    </w:p>
+    <w:p>
+      <w:r>
+        <w:rPr>
+          <w:sz w:val="22"/>
+        </w:rPr>
+        <w:t>Tutores, coordinador académico y docente del curso, al inicio o mitad del cuatrimestre,</w:t>
+      </w:r>
+    </w:p>
+    <w:p>
+      <w:r>
+        <w:rPr>
+          <w:sz w:val="22"/>
+        </w:rPr>
+        <w:t>ANTES del examen final. Por eso 'exam_score' no se usa como variable predictora</w:t>
+      </w:r>
+    </w:p>
+    <w:p>
+      <w:r>
+        <w:rPr>
+          <w:sz w:val="22"/>
+        </w:rPr>
+        <w:t>(sería data leakage: la decisión la tomamos antes de conocer la nota).</w:t>
+      </w:r>
+    </w:p>
+    <w:p/>
+    <w:p>
+      <w:r>
+        <w:rPr>
+          <w:sz w:val="22"/>
+        </w:rPr>
+        <w:t>SCORING vs CLASIFICACIÓN vs PREDICCIÓN</w:t>
+      </w:r>
+    </w:p>
+    <w:p>
+      <w:r>
+        <w:rPr>
+          <w:sz w:val="22"/>
+        </w:rPr>
+        <w:t>• Predicción: estima el valor de exam_score (regresión).</w:t>
+      </w:r>
+    </w:p>
+    <w:p>
+      <w:r>
+        <w:rPr>
+          <w:sz w:val="22"/>
+        </w:rPr>
+        <w:t>• Clasificación: asigna 0 o 1 (¿desaprobará o no?).</w:t>
+      </w:r>
+    </w:p>
+    <w:p>
+      <w:r>
+        <w:rPr>
+          <w:sz w:val="22"/>
+        </w:rPr>
+        <w:t>• Scoring: ordena a los estudiantes en 0-100 para priorizar intervenciones.</w:t>
+      </w:r>
+    </w:p>
+    <w:p>
+      <w:pPr>
+        <w:pStyle w:val="Heading1"/>
+      </w:pPr>
+      <w:r>
+        <w:rPr>
+          <w:color w:val="2C3E50"/>
+        </w:rPr>
+        <w:t>2. Exploración del dataset</w:t>
       </w:r>
     </w:p>
     <w:p>
@@ -446,7 +942,7 @@
         <w:rPr>
           <w:color w:val="2C3E50"/>
         </w:rPr>
-        <w:t>Respuestas — Comprensión del problema</w:t>
+        <w:t>Principales hallazgos de la exploración</w:t>
       </w:r>
     </w:p>
     <w:p>
@@ -454,15 +950,16 @@
         <w:rPr>
           <w:sz w:val="22"/>
         </w:rPr>
-        <w:t>¿QUÉ DECISIÓN CONCRETA SE BUSCA APOYAR CON EL SCORE?</w:t>
-      </w:r>
-    </w:p>
+        <w:t>• 200 estudiantes, sin nulos ni duplicados → no requiere imputación.</w:t>
+      </w:r>
+    </w:p>
+    <w:p/>
     <w:p>
       <w:r>
         <w:rPr>
           <w:sz w:val="22"/>
         </w:rPr>
-        <w:t>Identificar, antes del examen final, qué estudiantes tienen mayor riesgo</w:t>
+        <w:t>• exam_score va de 17.1 a 51.3 —</w:t>
       </w:r>
     </w:p>
     <w:p>
@@ -470,7 +967,7 @@
         <w:rPr>
           <w:sz w:val="22"/>
         </w:rPr>
-        <w:t>de bajo desempeño para activar intervenciones de la cátedra: tutorías,</w:t>
+        <w:t xml:space="preserve">  no es un 0-100 clásico. Por eso no aplica el umbral de 60 del enunciado:</w:t>
       </w:r>
     </w:p>
     <w:p>
@@ -478,15 +975,16 @@
         <w:rPr>
           <w:sz w:val="22"/>
         </w:rPr>
-        <w:t>material de refuerzo, seguimiento personalizado y, en casos críticos,</w:t>
-      </w:r>
-    </w:p>
+        <w:t xml:space="preserve">  dejaría al 100% de los estudiantes como 'riesgo'.</w:t>
+      </w:r>
+    </w:p>
+    <w:p/>
     <w:p>
       <w:r>
         <w:rPr>
           <w:sz w:val="22"/>
         </w:rPr>
-        <w:t>tutoría obligatoria con seguimiento semanal.</w:t>
+        <w:t>• previous_scores está en escala 40-95 (parece promedio académico previo 0-100).</w:t>
       </w:r>
     </w:p>
     <w:p/>
@@ -495,15 +993,16 @@
         <w:rPr>
           <w:sz w:val="22"/>
         </w:rPr>
-        <w:t>¿QUIÉN LO UTILIZARÁ Y EN QUÉ MOMENTO?</w:t>
-      </w:r>
-    </w:p>
+        <w:t>• hours_studied, sleep_hours y attendance_percent están en rangos plausibles.</w:t>
+      </w:r>
+    </w:p>
+    <w:p/>
     <w:p>
       <w:r>
         <w:rPr>
           <w:sz w:val="22"/>
         </w:rPr>
-        <w:t>Tutores, coordinador académico y docente del curso. Se aplica al inicio</w:t>
+        <w:t>• Predictor más fuerte: hours_studied (r = 0.78 con exam_score).</w:t>
       </w:r>
     </w:p>
     <w:p>
@@ -511,96 +1010,18 @@
         <w:rPr>
           <w:sz w:val="22"/>
         </w:rPr>
-        <w:t>o a mitad del cuatrimestre, ANTES del examen final — por eso exam_score</w:t>
-      </w:r>
-    </w:p>
-    <w:p>
-      <w:r>
-        <w:rPr>
-          <w:sz w:val="22"/>
-        </w:rPr>
-        <w:t>no se usa como variable predictora (sería data leakage: se predeciría</w:t>
-      </w:r>
-    </w:p>
-    <w:p>
-      <w:r>
-        <w:rPr>
-          <w:sz w:val="22"/>
-        </w:rPr>
-        <w:t>una decisión usando información que aún no se conoce).</w:t>
-      </w:r>
-    </w:p>
-    <w:p/>
-    <w:p>
-      <w:r>
-        <w:rPr>
-          <w:sz w:val="22"/>
-        </w:rPr>
-        <w:t>¿CUÁL ES LA DIFERENCIA ENTRE SCORING, CLASIFICACIÓN Y PREDICCIÓN?</w:t>
-      </w:r>
-    </w:p>
-    <w:p>
-      <w:r>
-        <w:rPr>
-          <w:sz w:val="22"/>
-        </w:rPr>
-        <w:t>• Predicción: estima el VALOR de una variable continua (ej. la nota</w:t>
-      </w:r>
-    </w:p>
-    <w:p>
-      <w:r>
-        <w:rPr>
-          <w:sz w:val="22"/>
-        </w:rPr>
-        <w:t xml:space="preserve">  exacta en el examen). Es regresión.</w:t>
-      </w:r>
-    </w:p>
-    <w:p>
-      <w:r>
-        <w:rPr>
-          <w:sz w:val="22"/>
-        </w:rPr>
-        <w:t>• Clasificación: asigna una ETIQUETA discreta (ej. desaprueba sí/no).</w:t>
-      </w:r>
-    </w:p>
-    <w:p>
-      <w:r>
-        <w:rPr>
-          <w:sz w:val="22"/>
-        </w:rPr>
-        <w:t xml:space="preserve">  Su salida es binaria o multiclase, no permite priorizar dentro de</w:t>
-      </w:r>
-    </w:p>
-    <w:p>
-      <w:r>
-        <w:rPr>
-          <w:sz w:val="22"/>
-        </w:rPr>
-        <w:t xml:space="preserve">  cada clase.</w:t>
-      </w:r>
-    </w:p>
-    <w:p>
-      <w:r>
-        <w:rPr>
-          <w:sz w:val="22"/>
-        </w:rPr>
-        <w:t>• Scoring: ORDENA a los individuos en una escala continua (0-100) para</w:t>
-      </w:r>
-    </w:p>
-    <w:p>
-      <w:r>
-        <w:rPr>
-          <w:sz w:val="22"/>
-        </w:rPr>
-        <w:t xml:space="preserve">  priorizar acciones. Permite elegir el umbral según la capacidad</w:t>
-      </w:r>
-    </w:p>
-    <w:p>
-      <w:r>
-        <w:rPr>
-          <w:sz w:val="22"/>
-        </w:rPr>
-        <w:t xml:space="preserve">  operativa (cuántas tutorías hay disponibles).</w:t>
+        <w:t xml:space="preserve">  Le sigue previous_scores (r = 0.43), después attendance (0.23) y sleep_hours (0.19).</w:t>
+      </w:r>
+    </w:p>
+    <w:p>
+      <w:pPr>
+        <w:pStyle w:val="Heading1"/>
+      </w:pPr>
+      <w:r>
+        <w:rPr>
+          <w:color w:val="2C3E50"/>
+        </w:rPr>
+        <w:t>3. Variable objetivo (qué se quiere predecir)</w:t>
       </w:r>
     </w:p>
     <w:p>
@@ -611,7 +1032,7 @@
         <w:rPr>
           <w:color w:val="2C3E50"/>
         </w:rPr>
-        <w:t>Diseño del score</w:t>
+        <w:t>Cómo se define la variable de riesgo</w:t>
       </w:r>
     </w:p>
     <w:p>
@@ -619,7 +1040,31 @@
         <w:rPr>
           <w:sz w:val="22"/>
         </w:rPr>
-        <w:t>• ¿Qué variables son más relevantes y por qué?</w:t>
+        <w:t>DECISIÓN</w:t>
+      </w:r>
+    </w:p>
+    <w:p>
+      <w:r>
+        <w:rPr>
+          <w:sz w:val="22"/>
+        </w:rPr>
+        <w:t>Como exam_score no está en escala 0-100 estándar, el umbral se define</w:t>
+      </w:r>
+    </w:p>
+    <w:p>
+      <w:r>
+        <w:rPr>
+          <w:sz w:val="22"/>
+        </w:rPr>
+        <w:t>usando el cuartil inferior de la propia distribución: el 25 % de estudiantes</w:t>
+      </w:r>
+    </w:p>
+    <w:p>
+      <w:r>
+        <w:rPr>
+          <w:sz w:val="22"/>
+        </w:rPr>
+        <w:t>con peor nota se considera 'bajo desempeño'.</w:t>
       </w:r>
     </w:p>
     <w:p/>
@@ -628,7 +1073,23 @@
         <w:rPr>
           <w:sz w:val="22"/>
         </w:rPr>
-        <w:t>• ¿Cómo se justifican los pesos asignados?</w:t>
+        <w:t>REGLA</w:t>
+      </w:r>
+    </w:p>
+    <w:p>
+      <w:r>
+        <w:rPr>
+          <w:sz w:val="22"/>
+        </w:rPr>
+        <w:t xml:space="preserve">  riesgo_bajo_desempeno = 1   si exam_score &lt; 29.50</w:t>
+      </w:r>
+    </w:p>
+    <w:p>
+      <w:r>
+        <w:rPr>
+          <w:sz w:val="22"/>
+        </w:rPr>
+        <w:t xml:space="preserve">  riesgo_bajo_desempeno = 0   en caso contrario</w:t>
       </w:r>
     </w:p>
     <w:p/>
@@ -637,7 +1098,23 @@
         <w:rPr>
           <w:sz w:val="22"/>
         </w:rPr>
-        <w:t>• ¿Qué pasa si una variable está en una escala distinta a las demás?</w:t>
+        <w:t>DISTRIBUCIÓN OBSERVADA</w:t>
+      </w:r>
+    </w:p>
+    <w:p>
+      <w:r>
+        <w:rPr>
+          <w:sz w:val="22"/>
+        </w:rPr>
+        <w:t xml:space="preserve">  • Clase 0 (sin riesgo): 75.5 %</w:t>
+      </w:r>
+    </w:p>
+    <w:p>
+      <w:r>
+        <w:rPr>
+          <w:sz w:val="22"/>
+        </w:rPr>
+        <w:t xml:space="preserve">  • Clase 1 (riesgo):     24.5 %</w:t>
       </w:r>
     </w:p>
     <w:p/>
@@ -646,7 +1123,37 @@
         <w:rPr>
           <w:sz w:val="22"/>
         </w:rPr>
-        <w:t>• ¿Cómo se eligen los umbrales o niveles de score?</w:t>
+        <w:t>Es un criterio relativo, transparente y reproducible. En otra cohorte habría</w:t>
+      </w:r>
+    </w:p>
+    <w:p>
+      <w:r>
+        <w:rPr>
+          <w:sz w:val="22"/>
+        </w:rPr>
+        <w:t>que recalibrar el umbral.</w:t>
+      </w:r>
+    </w:p>
+    <w:p>
+      <w:pPr>
+        <w:pStyle w:val="Heading1"/>
+      </w:pPr>
+      <w:r>
+        <w:rPr>
+          <w:color w:val="2C3E50"/>
+        </w:rPr>
+        <w:t>4. Scoring por reglas (pesos y rangos definidos a mano)</w:t>
+      </w:r>
+    </w:p>
+    <w:p>
+      <w:pPr>
+        <w:pStyle w:val="Heading1"/>
+      </w:pPr>
+      <w:r>
+        <w:rPr>
+          <w:color w:val="2C3E50"/>
+        </w:rPr>
+        <w:t>5. Niveles de riesgo y acción recomendada</w:t>
       </w:r>
     </w:p>
     <w:p>
@@ -657,7 +1164,7 @@
         <w:rPr>
           <w:color w:val="2C3E50"/>
         </w:rPr>
-        <w:t>Respuestas — Diseño del score</w:t>
+        <w:t>El score crece con el riesgo real (validación empírica)</w:t>
       </w:r>
     </w:p>
     <w:p>
@@ -665,7 +1172,7 @@
         <w:rPr>
           <w:sz w:val="22"/>
         </w:rPr>
-        <w:t>¿QUÉ VARIABLES SON MÁS RELEVANTES Y POR QUÉ?</w:t>
+        <w:t>Si el score por reglas funciona, la 'tasa de bajo desempeño' debe crecer</w:t>
       </w:r>
     </w:p>
     <w:p>
@@ -673,15 +1180,16 @@
         <w:rPr>
           <w:sz w:val="22"/>
         </w:rPr>
-        <w:t>Según el EDA, hours_studied es la más fuerte (r = 0.78 con exam_score),</w:t>
-      </w:r>
-    </w:p>
+        <w:t>monotónicamente del nivel Bajo al Crítico. Es lo que se observa:</w:t>
+      </w:r>
+    </w:p>
+    <w:p/>
     <w:p>
       <w:r>
         <w:rPr>
           <w:sz w:val="22"/>
         </w:rPr>
-        <w:t>seguida de previous_scores (r = 0.43), attendance_percent (r = 0.23) y</w:t>
+        <w:t xml:space="preserve">  Bajo    →   0.0 % de los estudiantes desaprueba</w:t>
       </w:r>
     </w:p>
     <w:p>
@@ -689,7 +1197,7 @@
         <w:rPr>
           <w:sz w:val="22"/>
         </w:rPr>
-        <w:t>sleep_hours (r = 0.19). Las dos primeras concentran ~70 % del poder</w:t>
+        <w:t xml:space="preserve">  Medio   →   1.5 %</w:t>
       </w:r>
     </w:p>
     <w:p>
@@ -697,7 +1205,7 @@
         <w:rPr>
           <w:sz w:val="22"/>
         </w:rPr>
-        <w:t>predictivo; las dos restantes se incluyen porque tienen sustento</w:t>
+        <w:t xml:space="preserve">  Alto    →  34.4 %</w:t>
       </w:r>
     </w:p>
     <w:p>
@@ -705,154 +1213,35 @@
         <w:rPr>
           <w:sz w:val="22"/>
         </w:rPr>
-        <w:t>teórico (compromiso y descanso afectan rendimiento) aunque correlacionen</w:t>
-      </w:r>
-    </w:p>
+        <w:t xml:space="preserve">  Crítico →  84.4 %</w:t>
+      </w:r>
+    </w:p>
+    <w:p/>
     <w:p>
       <w:r>
         <w:rPr>
           <w:sz w:val="22"/>
         </w:rPr>
-        <w:t>menos.</w:t>
-      </w:r>
-    </w:p>
-    <w:p/>
+        <w:t>El salto entre Alto y Crítico es la señal más fuerte: el score por reglas</w:t>
+      </w:r>
+    </w:p>
     <w:p>
       <w:r>
         <w:rPr>
           <w:sz w:val="22"/>
         </w:rPr>
-        <w:t>¿CÓMO SE JUSTIFICAN LOS PESOS ASIGNADOS?</w:t>
-      </w:r>
-    </w:p>
-    <w:p>
-      <w:r>
-        <w:rPr>
-          <w:sz w:val="22"/>
-        </w:rPr>
-        <w:t>Los pesos (40 / 30 / 20 / 10 %) replican el ORDEN de correlación con</w:t>
-      </w:r>
-    </w:p>
-    <w:p>
-      <w:r>
-        <w:rPr>
-          <w:sz w:val="22"/>
-        </w:rPr>
-        <w:t>exam_score y respetan que la suma sea 100 %. No vienen de un ajuste</w:t>
-      </w:r>
-    </w:p>
-    <w:p>
-      <w:r>
-        <w:rPr>
-          <w:sz w:val="22"/>
-        </w:rPr>
-        <w:t>automático sino de criterio experto + evidencia del EDA. Esto los hace</w:t>
-      </w:r>
-    </w:p>
-    <w:p>
-      <w:r>
-        <w:rPr>
-          <w:sz w:val="22"/>
-        </w:rPr>
-        <w:t>auditables y explicables ante un usuario no técnico.</w:t>
-      </w:r>
-    </w:p>
-    <w:p/>
-    <w:p>
-      <w:r>
-        <w:rPr>
-          <w:sz w:val="22"/>
-        </w:rPr>
-        <w:t>¿QUÉ PASA SI UNA VARIABLE ESTÁ EN UNA ESCALA DISTINTA?</w:t>
-      </w:r>
-    </w:p>
-    <w:p>
-      <w:r>
-        <w:rPr>
-          <w:sz w:val="22"/>
-        </w:rPr>
-        <w:t>Hay que NORMALIZAR antes de combinar. En el score por reglas se usa</w:t>
-      </w:r>
-    </w:p>
-    <w:p>
-      <w:r>
-        <w:rPr>
-          <w:sz w:val="22"/>
-        </w:rPr>
-        <w:t>norm_riesgo(valor, bueno, malo) que mapea cada variable a [0, 100] con</w:t>
-      </w:r>
-    </w:p>
-    <w:p>
-      <w:r>
-        <w:rPr>
-          <w:sz w:val="22"/>
-        </w:rPr>
-        <w:t>rangos definidos por dominio. En el modelo, StandardScaler estandariza</w:t>
-      </w:r>
-    </w:p>
-    <w:p>
-      <w:r>
-        <w:rPr>
-          <w:sz w:val="22"/>
-        </w:rPr>
-        <w:t>(media 0, std 1) para que LogisticRegression no penalice variables</w:t>
-      </w:r>
-    </w:p>
-    <w:p>
-      <w:r>
-        <w:rPr>
-          <w:sz w:val="22"/>
-        </w:rPr>
-        <w:t>con mayor varianza nominal.</w:t>
-      </w:r>
-    </w:p>
-    <w:p/>
-    <w:p>
-      <w:r>
-        <w:rPr>
-          <w:sz w:val="22"/>
-        </w:rPr>
-        <w:t>¿CÓMO SE ELIGEN LOS UMBRALES O NIVELES DE SCORE?</w:t>
-      </w:r>
-    </w:p>
-    <w:p>
-      <w:r>
-        <w:rPr>
-          <w:sz w:val="22"/>
-        </w:rPr>
-        <w:t>Se usaron cortes en 30 / 50 / 70 que dividen la escala en cuatro</w:t>
-      </w:r>
-    </w:p>
-    <w:p>
-      <w:r>
-        <w:rPr>
-          <w:sz w:val="22"/>
-        </w:rPr>
-        <w:t>niveles operativos (Bajo / Medio / Alto / Crítico) y se VALIDARON</w:t>
-      </w:r>
-    </w:p>
-    <w:p>
-      <w:r>
-        <w:rPr>
-          <w:sz w:val="22"/>
-        </w:rPr>
-        <w:t>empíricamente: la tasa real de bajo desempeño debe crecer monotónicamente</w:t>
-      </w:r>
-    </w:p>
-    <w:p>
-      <w:r>
-        <w:rPr>
-          <w:sz w:val="22"/>
-        </w:rPr>
-        <w:t>de Bajo a Crítico, lo que se cumple. En otra cohorte habría que</w:t>
-      </w:r>
-    </w:p>
-    <w:p>
-      <w:r>
-        <w:rPr>
-          <w:sz w:val="22"/>
-        </w:rPr>
-        <w:t>recalibrarlos.</w:t>
+        <w:t>logra concentrar el riesgo real en el extremo superior de la escala.</w:t>
+      </w:r>
+    </w:p>
+    <w:p>
+      <w:pPr>
+        <w:pStyle w:val="Heading1"/>
+      </w:pPr>
+      <w:r>
+        <w:rPr>
+          <w:color w:val="2C3E50"/>
+        </w:rPr>
+        <w:t>6. Modelo predictivo entrenado con scikit-learn</w:t>
       </w:r>
     </w:p>
     <w:p>
@@ -863,7 +1252,7 @@
         <w:rPr>
           <w:color w:val="2C3E50"/>
         </w:rPr>
-        <w:t>Modelo predictivo</w:t>
+        <w:t>Tipo de problema, variables y modelos comparados</w:t>
       </w:r>
     </w:p>
     <w:p>
@@ -871,7 +1260,23 @@
         <w:rPr>
           <w:sz w:val="22"/>
         </w:rPr>
-        <w:t>• ¿Qué tipo de problema es: clasificación binaria, multiclase, regresión?</w:t>
+        <w:t>TIPO DE PROBLEMA</w:t>
+      </w:r>
+    </w:p>
+    <w:p>
+      <w:r>
+        <w:rPr>
+          <w:sz w:val="22"/>
+        </w:rPr>
+        <w:t>Clasificación binaria (riesgo / no riesgo). El usuario final necesita decidir</w:t>
+      </w:r>
+    </w:p>
+    <w:p>
+      <w:r>
+        <w:rPr>
+          <w:sz w:val="22"/>
+        </w:rPr>
+        <w:t>intervenir o no — output operativo, no estimar la nota exacta.</w:t>
       </w:r>
     </w:p>
     <w:p/>
@@ -880,7 +1285,7 @@
         <w:rPr>
           <w:sz w:val="22"/>
         </w:rPr>
-        <w:t>• ¿Por qué se eligió ese algoritmo (regresión logística, árbol, random</w:t>
+        <w:t>VARIABLES PREDICTORAS</w:t>
       </w:r>
     </w:p>
     <w:p>
@@ -888,7 +1293,15 @@
         <w:rPr>
           <w:sz w:val="22"/>
         </w:rPr>
-        <w:t xml:space="preserve">  forest, etc.)?</w:t>
+        <w:t>hours_studied, sleep_hours, attendance_percent, previous_scores.</w:t>
+      </w:r>
+    </w:p>
+    <w:p>
+      <w:r>
+        <w:rPr>
+          <w:sz w:val="22"/>
+        </w:rPr>
+        <w:t>Disponibles ANTES del examen final. exam_score se excluye (data leakage).</w:t>
       </w:r>
     </w:p>
     <w:p/>
@@ -897,7 +1310,7 @@
         <w:rPr>
           <w:sz w:val="22"/>
         </w:rPr>
-        <w:t>• ¿Qué decisiones de preprocesamiento se tomaron (split, escalado,</w:t>
+        <w:t>MODELOS COMPARADOS</w:t>
       </w:r>
     </w:p>
     <w:p>
@@ -905,7 +1318,78 @@
         <w:rPr>
           <w:sz w:val="22"/>
         </w:rPr>
-        <w:t xml:space="preserve">  encoding)?</w:t>
+        <w:t>• Logistic Regression: interpretable, rápido, baseline.</w:t>
+      </w:r>
+    </w:p>
+    <w:p>
+      <w:r>
+        <w:rPr>
+          <w:sz w:val="22"/>
+        </w:rPr>
+        <w:t>• Random Forest: capta no-linealidades, robusto a outliers.</w:t>
+      </w:r>
+    </w:p>
+    <w:p>
+      <w:r>
+        <w:rPr>
+          <w:sz w:val="22"/>
+        </w:rPr>
+        <w:t>Se elige el de mejor AUC en validación cruzada (5 folds).</w:t>
+      </w:r>
+    </w:p>
+    <w:p/>
+    <w:p>
+      <w:r>
+        <w:rPr>
+          <w:sz w:val="22"/>
+        </w:rPr>
+        <w:t>OTRAS DECISIONES</w:t>
+      </w:r>
+    </w:p>
+    <w:p>
+      <w:r>
+        <w:rPr>
+          <w:sz w:val="22"/>
+        </w:rPr>
+        <w:t>• train/test estratificado (clase positiva ≈ 25 %).</w:t>
+      </w:r>
+    </w:p>
+    <w:p>
+      <w:r>
+        <w:rPr>
+          <w:sz w:val="22"/>
+        </w:rPr>
+        <w:t>• StandardScaler en LR (sensible a escalas).</w:t>
+      </w:r>
+    </w:p>
+    <w:p>
+      <w:r>
+        <w:rPr>
+          <w:sz w:val="22"/>
+        </w:rPr>
+        <w:t>• Random state = 42 para reproducibilidad.</w:t>
+      </w:r>
+    </w:p>
+    <w:p>
+      <w:pPr>
+        <w:pStyle w:val="Heading1"/>
+      </w:pPr>
+      <w:r>
+        <w:rPr>
+          <w:color w:val="2C3E50"/>
+        </w:rPr>
+        <w:t>7. Comparación entre score por reglas y score por modelo</w:t>
+      </w:r>
+    </w:p>
+    <w:p>
+      <w:pPr>
+        <w:pStyle w:val="Heading1"/>
+      </w:pPr>
+      <w:r>
+        <w:rPr>
+          <w:color w:val="2C3E50"/>
+        </w:rPr>
+        <w:t>8. Evaluación del modelo con métricas de clasificación</w:t>
       </w:r>
     </w:p>
     <w:p>
@@ -916,7 +1400,7 @@
         <w:rPr>
           <w:color w:val="2C3E50"/>
         </w:rPr>
-        <w:t>Respuestas — Modelo predictivo</w:t>
+        <w:t>Qué error pesa más en este problema</w:t>
       </w:r>
     </w:p>
     <w:p>
@@ -924,15 +1408,16 @@
         <w:rPr>
           <w:sz w:val="22"/>
         </w:rPr>
-        <w:t>¿QUÉ TIPO DE PROBLEMA ES?</w:t>
-      </w:r>
-    </w:p>
+        <w:t>EN ESTE PROBLEMA, EL FALSO NEGATIVO ES MÁS GRAVE</w:t>
+      </w:r>
+    </w:p>
+    <w:p/>
     <w:p>
       <w:r>
         <w:rPr>
           <w:sz w:val="22"/>
         </w:rPr>
-        <w:t>CLASIFICACIÓN BINARIA: predice riesgo_bajo_desempeno ∈ {0, 1}. La</w:t>
+        <w:t>• FALSO NEGATIVO: el score dice 'sin riesgo' pero el estudiante desaprueba.</w:t>
       </w:r>
     </w:p>
     <w:p>
@@ -940,15 +1425,16 @@
         <w:rPr>
           <w:sz w:val="22"/>
         </w:rPr>
-        <w:t>decisión que necesita el tutor es operativa (intervenir o no), no</w:t>
-      </w:r>
-    </w:p>
+        <w:t xml:space="preserve">  Costo: no recibió la intervención y termina desaprobando.</w:t>
+      </w:r>
+    </w:p>
+    <w:p/>
     <w:p>
       <w:r>
         <w:rPr>
           <w:sz w:val="22"/>
         </w:rPr>
-        <w:t>estimar la nota exacta. Aunque internamente se trabaje con la</w:t>
+        <w:t>• FALSO POSITIVO: el score dice 'riesgo' pero el estudiante aprueba.</w:t>
       </w:r>
     </w:p>
     <w:p>
@@ -956,153 +1442,24 @@
         <w:rPr>
           <w:sz w:val="22"/>
         </w:rPr>
-        <w:t>probabilidad continua P(riesgo), eso es para SCORING, no para</w:t>
-      </w:r>
-    </w:p>
+        <w:t xml:space="preserve">  Costo: una entrevista innecesaria del tutor.</w:t>
+      </w:r>
+    </w:p>
+    <w:p/>
     <w:p>
       <w:r>
         <w:rPr>
           <w:sz w:val="22"/>
         </w:rPr>
-        <w:t>regresión sobre exam_score.</w:t>
-      </w:r>
-    </w:p>
-    <w:p/>
+        <w:t>→ Priorizamos RECALL sobre la clase positiva (riesgo). Para un score operativo,</w:t>
+      </w:r>
+    </w:p>
     <w:p>
       <w:r>
         <w:rPr>
           <w:sz w:val="22"/>
         </w:rPr>
-        <w:t>¿POR QUÉ SE ELIGIÓ ESE ALGORITMO?</w:t>
-      </w:r>
-    </w:p>
-    <w:p>
-      <w:r>
-        <w:rPr>
-          <w:sz w:val="22"/>
-        </w:rPr>
-        <w:t>Se compararon dos modelos con validación cruzada (5 folds, AUC):</w:t>
-      </w:r>
-    </w:p>
-    <w:p>
-      <w:r>
-        <w:rPr>
-          <w:sz w:val="22"/>
-        </w:rPr>
-        <w:t>• Logistic Regression: lineal, INTERPRETABLE (coeficientes leíbles),</w:t>
-      </w:r>
-    </w:p>
-    <w:p>
-      <w:r>
-        <w:rPr>
-          <w:sz w:val="22"/>
-        </w:rPr>
-        <w:t xml:space="preserve">  rápido, sirve como baseline robusto.</w:t>
-      </w:r>
-    </w:p>
-    <w:p>
-      <w:r>
-        <w:rPr>
-          <w:sz w:val="22"/>
-        </w:rPr>
-        <w:t>• Random Forest: capta no-linealidades e interacciones, más robusto a</w:t>
-      </w:r>
-    </w:p>
-    <w:p>
-      <w:r>
-        <w:rPr>
-          <w:sz w:val="22"/>
-        </w:rPr>
-        <w:t xml:space="preserve">  outliers, no requiere escalado.</w:t>
-      </w:r>
-    </w:p>
-    <w:p>
-      <w:r>
-        <w:rPr>
-          <w:sz w:val="22"/>
-        </w:rPr>
-        <w:t>Se eligió el de mejor AUC en CV. En contextos académicos con n pequeño</w:t>
-      </w:r>
-    </w:p>
-    <w:p>
-      <w:r>
-        <w:rPr>
-          <w:sz w:val="22"/>
-        </w:rPr>
-        <w:t>y necesidad de explicabilidad, LR suele ganar — fue el caso (AUC = 0.956</w:t>
-      </w:r>
-    </w:p>
-    <w:p>
-      <w:r>
-        <w:rPr>
-          <w:sz w:val="22"/>
-        </w:rPr>
-        <w:t>vs 0.917).</w:t>
-      </w:r>
-    </w:p>
-    <w:p/>
-    <w:p>
-      <w:r>
-        <w:rPr>
-          <w:sz w:val="22"/>
-        </w:rPr>
-        <w:t>¿QUÉ DECISIONES DE PREPROCESAMIENTO SE TOMARON?</w:t>
-      </w:r>
-    </w:p>
-    <w:p>
-      <w:r>
-        <w:rPr>
-          <w:sz w:val="22"/>
-        </w:rPr>
-        <w:t>• SPLIT: train/test 70/30 ESTRATIFICADO por la clase positiva (~25 %)</w:t>
-      </w:r>
-    </w:p>
-    <w:p>
-      <w:r>
-        <w:rPr>
-          <w:sz w:val="22"/>
-        </w:rPr>
-        <w:t xml:space="preserve">  para que ambos sets mantengan la misma proporción de riesgo.</w:t>
-      </w:r>
-    </w:p>
-    <w:p>
-      <w:r>
-        <w:rPr>
-          <w:sz w:val="22"/>
-        </w:rPr>
-        <w:t>• ESCALADO: StandardScaler dentro de un Pipeline para LR (sensible a</w:t>
-      </w:r>
-    </w:p>
-    <w:p>
-      <w:r>
-        <w:rPr>
-          <w:sz w:val="22"/>
-        </w:rPr>
-        <w:t xml:space="preserve">  escala). RF no lo necesita.</w:t>
-      </w:r>
-    </w:p>
-    <w:p>
-      <w:r>
-        <w:rPr>
-          <w:sz w:val="22"/>
-        </w:rPr>
-        <w:t>• ENCODING: no aplica — todas las features son numéricas.</w:t>
-      </w:r>
-    </w:p>
-    <w:p>
-      <w:r>
-        <w:rPr>
-          <w:sz w:val="22"/>
-        </w:rPr>
-        <w:t>• SEMILLA: random_state = 42 para reproducibilidad.</w:t>
-      </w:r>
-    </w:p>
-    <w:p>
-      <w:r>
-        <w:rPr>
-          <w:sz w:val="22"/>
-        </w:rPr>
-        <w:t>• EXAM_SCORE EXCLUIDO: para evitar data leakage (es lo que se predice).</w:t>
+        <w:t>fijamos un umbral que capture al menos el 70-80 % de los casos positivos.</w:t>
       </w:r>
     </w:p>
     <w:p>
@@ -1113,7 +1470,7 @@
         <w:rPr>
           <w:color w:val="2C3E50"/>
         </w:rPr>
-        <w:t>Evaluación</w:t>
+        <w:t>Qué dice la matriz de confusión en el umbral operativo</w:t>
       </w:r>
     </w:p>
     <w:p>
@@ -1121,7 +1478,7 @@
         <w:rPr>
           <w:sz w:val="22"/>
         </w:rPr>
-        <w:t>• ¿Qué métrica es la más adecuada para este caso?</w:t>
+        <w:t>En el set de test (n = 60) y con umbral operativo 50:</w:t>
       </w:r>
     </w:p>
     <w:p/>
@@ -1130,7 +1487,15 @@
         <w:rPr>
           <w:sz w:val="22"/>
         </w:rPr>
-        <w:t>• ¿Es más grave un falso positivo o un falso negativo?</w:t>
+        <w:t xml:space="preserve">  → De 15 estudiantes con riesgo real, el modelo detectó 12</w:t>
+      </w:r>
+    </w:p>
+    <w:p>
+      <w:r>
+        <w:rPr>
+          <w:sz w:val="22"/>
+        </w:rPr>
+        <w:t xml:space="preserve">    y dejó pasar 3  (recall = 80%).</w:t>
       </w:r>
     </w:p>
     <w:p/>
@@ -1139,7 +1504,144 @@
         <w:rPr>
           <w:sz w:val="22"/>
         </w:rPr>
-        <w:t>• ¿El score es estable ante pequeños cambios en los datos?</w:t>
+        <w:t xml:space="preserve">  → De 45 estudiantes sin riesgo, el modelo clasificó bien 44</w:t>
+      </w:r>
+    </w:p>
+    <w:p>
+      <w:r>
+        <w:rPr>
+          <w:sz w:val="22"/>
+        </w:rPr>
+        <w:t xml:space="preserve">    y marcó 1 como riesgo erróneamente  (specificity = 98%).</w:t>
+      </w:r>
+    </w:p>
+    <w:p/>
+    <w:p>
+      <w:r>
+        <w:rPr>
+          <w:sz w:val="22"/>
+        </w:rPr>
+        <w:t xml:space="preserve">  → De los 13 alumnos que el modelo señaló como en riesgo,</w:t>
+      </w:r>
+    </w:p>
+    <w:p>
+      <w:r>
+        <w:rPr>
+          <w:sz w:val="22"/>
+        </w:rPr>
+        <w:t xml:space="preserve">    12 efectivamente lo estaban  (precision = 92%).</w:t>
+      </w:r>
+    </w:p>
+    <w:p/>
+    <w:p>
+      <w:r>
+        <w:rPr>
+          <w:sz w:val="22"/>
+        </w:rPr>
+        <w:t>INTERPRETACIÓN OPERATIVA</w:t>
+      </w:r>
+    </w:p>
+    <w:p/>
+    <w:p>
+      <w:r>
+        <w:rPr>
+          <w:sz w:val="22"/>
+        </w:rPr>
+        <w:t>• Falsos negativos = 3  ← son los más graves: el sistema dice 'no</w:t>
+      </w:r>
+    </w:p>
+    <w:p>
+      <w:r>
+        <w:rPr>
+          <w:sz w:val="22"/>
+        </w:rPr>
+        <w:t xml:space="preserve">  hace falta intervenir' y el alumno termina desaprobando. Cada FN</w:t>
+      </w:r>
+    </w:p>
+    <w:p>
+      <w:r>
+        <w:rPr>
+          <w:sz w:val="22"/>
+        </w:rPr>
+        <w:t xml:space="preserve">  representa una oportunidad perdida de ayudar.</w:t>
+      </w:r>
+    </w:p>
+    <w:p/>
+    <w:p>
+      <w:r>
+        <w:rPr>
+          <w:sz w:val="22"/>
+        </w:rPr>
+        <w:t>• Falsos positivos = 1  ← son tolerables: solo cuestan una entrevista</w:t>
+      </w:r>
+    </w:p>
+    <w:p>
+      <w:r>
+        <w:rPr>
+          <w:sz w:val="22"/>
+        </w:rPr>
+        <w:t xml:space="preserve">  innecesaria con el tutor.</w:t>
+      </w:r>
+    </w:p>
+    <w:p/>
+    <w:p>
+      <w:r>
+        <w:rPr>
+          <w:sz w:val="22"/>
+        </w:rPr>
+        <w:t>• Si la cátedra tuviera capacidad para más casos, podría bajar el</w:t>
+      </w:r>
+    </w:p>
+    <w:p>
+      <w:r>
+        <w:rPr>
+          <w:sz w:val="22"/>
+        </w:rPr>
+        <w:t xml:space="preserve">  umbral (ej. a 40) y subir recall a costa de algo de precision.</w:t>
+      </w:r>
+    </w:p>
+    <w:p>
+      <w:r>
+        <w:rPr>
+          <w:sz w:val="22"/>
+        </w:rPr>
+        <w:t xml:space="preserve">  Si la capacidad fuera muy escasa, subir el umbral (ej. a 60) elevaría</w:t>
+      </w:r>
+    </w:p>
+    <w:p>
+      <w:r>
+        <w:rPr>
+          <w:sz w:val="22"/>
+        </w:rPr>
+        <w:t xml:space="preserve">  precision pero dejaría más alumnos en riesgo sin ayuda.</w:t>
+      </w:r>
+    </w:p>
+    <w:p/>
+    <w:p>
+      <w:r>
+        <w:rPr>
+          <w:sz w:val="22"/>
+        </w:rPr>
+        <w:t>La tabla de la próxima página muestra esa misma matriz pero a 4 umbrales,</w:t>
+      </w:r>
+    </w:p>
+    <w:p>
+      <w:r>
+        <w:rPr>
+          <w:sz w:val="22"/>
+        </w:rPr>
+        <w:t>para apoyar la decisión del corte operativo.</w:t>
+      </w:r>
+    </w:p>
+    <w:p>
+      <w:pPr>
+        <w:pStyle w:val="Heading1"/>
+      </w:pPr>
+      <w:r>
+        <w:rPr>
+          <w:color w:val="2C3E50"/>
+        </w:rPr>
+        <w:t>9. Casos individuales (tres estudiantes de ejemplo)</w:t>
       </w:r>
     </w:p>
     <w:p>
@@ -1150,7 +1652,7 @@
         <w:rPr>
           <w:color w:val="2C3E50"/>
         </w:rPr>
-        <w:t>Respuestas — Evaluación</w:t>
+        <w:t>Ejemplo: cómo explicar el score a un estudiante</w:t>
       </w:r>
     </w:p>
     <w:p>
@@ -1158,15 +1660,16 @@
         <w:rPr>
           <w:sz w:val="22"/>
         </w:rPr>
-        <w:t>¿QUÉ MÉTRICA ES LA MÁS ADECUADA PARA ESTE CASO?</w:t>
-      </w:r>
-    </w:p>
+        <w:t>EJEMPLO — caso crítico</w:t>
+      </w:r>
+    </w:p>
+    <w:p/>
     <w:p>
       <w:r>
         <w:rPr>
           <w:sz w:val="22"/>
         </w:rPr>
-        <w:t>Hay dos lecturas complementarias:</w:t>
+        <w:t>Estudiante S125 recibió un score alto porque combina:</w:t>
       </w:r>
     </w:p>
     <w:p>
@@ -1174,7 +1677,7 @@
         <w:rPr>
           <w:sz w:val="22"/>
         </w:rPr>
-        <w:t>• AUC-ROC: evalúa la calidad del RANKING completo, independiente del</w:t>
+        <w:t xml:space="preserve">  • 1.0 horas de estudio (rango bajo: ≤ 2 hs)</w:t>
       </w:r>
     </w:p>
     <w:p>
@@ -1182,7 +1685,7 @@
         <w:rPr>
           <w:sz w:val="22"/>
         </w:rPr>
-        <w:t xml:space="preserve">  umbral. Útil porque el score se puede leer a distintos cortes según</w:t>
+        <w:t xml:space="preserve">  • 54 en desempeño previo (rango bajo: ≤ 50)</w:t>
       </w:r>
     </w:p>
     <w:p>
@@ -1190,7 +1693,7 @@
         <w:rPr>
           <w:sz w:val="22"/>
         </w:rPr>
-        <w:t xml:space="preserve">  la capacidad operativa de la cátedra.</w:t>
+        <w:t xml:space="preserve">  • 82.6 % de asistencia</w:t>
       </w:r>
     </w:p>
     <w:p>
@@ -1198,15 +1701,16 @@
         <w:rPr>
           <w:sz w:val="22"/>
         </w:rPr>
-        <w:t>• RECALL sobre la clase positiva (riesgo): para el umbral elegido,</w:t>
-      </w:r>
-    </w:p>
+        <w:t xml:space="preserve">  • 4.1 horas promedio de sueño</w:t>
+      </w:r>
+    </w:p>
+    <w:p/>
     <w:p>
       <w:r>
         <w:rPr>
           <w:sz w:val="22"/>
         </w:rPr>
-        <w:t xml:space="preserve">  importa cuántos casos de riesgo real se detectan. Un recall del 70-80 %</w:t>
+        <w:t>Las variables apuntan en la misma dirección, por eso el score lo ubica en el</w:t>
       </w:r>
     </w:p>
     <w:p>
@@ -1214,15 +1718,16 @@
         <w:rPr>
           <w:sz w:val="22"/>
         </w:rPr>
-        <w:t xml:space="preserve">  es el objetivo operativo.</w:t>
-      </w:r>
-    </w:p>
+        <w:t>nivel crítico y se recomienda tutoría obligatoria con seguimiento semanal.</w:t>
+      </w:r>
+    </w:p>
+    <w:p/>
     <w:p>
       <w:r>
         <w:rPr>
           <w:sz w:val="22"/>
         </w:rPr>
-        <w:t>Accuracy NO es la mejor porque la clase está desbalanceada (~25 % positivos):</w:t>
+        <w:t>El estudiante puede 'mejorar' su score aumentando horas de estudio y asistencia</w:t>
       </w:r>
     </w:p>
     <w:p>
@@ -1230,129 +1735,18 @@
         <w:rPr>
           <w:sz w:val="22"/>
         </w:rPr>
-        <w:t>predecir 'siempre 0' daría 75 % accuracy y sería inútil.</w:t>
-      </w:r>
-    </w:p>
-    <w:p/>
-    <w:p>
-      <w:r>
-        <w:rPr>
-          <w:sz w:val="22"/>
-        </w:rPr>
-        <w:t>¿ES MÁS GRAVE UN FALSO POSITIVO O UN FALSO NEGATIVO?</w:t>
-      </w:r>
-    </w:p>
-    <w:p>
-      <w:r>
-        <w:rPr>
-          <w:sz w:val="22"/>
-        </w:rPr>
-        <w:t>FALSO NEGATIVO es claramente más grave en este dominio:</w:t>
-      </w:r>
-    </w:p>
-    <w:p>
-      <w:r>
-        <w:rPr>
-          <w:sz w:val="22"/>
-        </w:rPr>
-        <w:t>• FN: el score dice 'sin riesgo' y el alumno termina desaprobando.</w:t>
-      </w:r>
-    </w:p>
-    <w:p>
-      <w:r>
-        <w:rPr>
-          <w:sz w:val="22"/>
-        </w:rPr>
-        <w:t xml:space="preserve">  Costo: oportunidad perdida de ayudar; impacto académico real.</w:t>
-      </w:r>
-    </w:p>
-    <w:p>
-      <w:r>
-        <w:rPr>
-          <w:sz w:val="22"/>
-        </w:rPr>
-        <w:t>• FP: el score dice 'riesgo' y el alumno aprueba.</w:t>
-      </w:r>
-    </w:p>
-    <w:p>
-      <w:r>
-        <w:rPr>
-          <w:sz w:val="22"/>
-        </w:rPr>
-        <w:t xml:space="preserve">  Costo: una entrevista innecesaria del tutor (bajo, reversible).</w:t>
-      </w:r>
-    </w:p>
-    <w:p>
-      <w:r>
-        <w:rPr>
-          <w:sz w:val="22"/>
-        </w:rPr>
-        <w:t>Por eso se prioriza RECALL sobre precision al elegir el umbral.</w:t>
-      </w:r>
-    </w:p>
-    <w:p/>
-    <w:p>
-      <w:r>
-        <w:rPr>
-          <w:sz w:val="22"/>
-        </w:rPr>
-        <w:t>¿EL SCORE ES ESTABLE ANTE PEQUEÑOS CAMBIOS EN LOS DATOS?</w:t>
-      </w:r>
-    </w:p>
-    <w:p>
-      <w:r>
-        <w:rPr>
-          <w:sz w:val="22"/>
-        </w:rPr>
-        <w:t>Indicadores de estabilidad observados:</w:t>
-      </w:r>
-    </w:p>
-    <w:p>
-      <w:r>
-        <w:rPr>
-          <w:sz w:val="22"/>
-        </w:rPr>
-        <w:t>• AUC en CV (5 folds, train) ≈ AUC en test → no hay sobreajuste fuerte.</w:t>
-      </w:r>
-    </w:p>
-    <w:p>
-      <w:r>
-        <w:rPr>
-          <w:sz w:val="22"/>
-        </w:rPr>
-        <w:t>• Score por reglas y score por modelo correlacionan fuertemente pese a</w:t>
-      </w:r>
-    </w:p>
-    <w:p>
-      <w:r>
-        <w:rPr>
-          <w:sz w:val="22"/>
-        </w:rPr>
-        <w:t xml:space="preserve">  construirse de forma totalmente distinta → señal consistente.</w:t>
-      </w:r>
-    </w:p>
-    <w:p>
-      <w:r>
-        <w:rPr>
-          <w:sz w:val="22"/>
-        </w:rPr>
-        <w:t>• La tasa real de bajo desempeño crece monotónicamente con el nivel.</w:t>
-      </w:r>
-    </w:p>
-    <w:p>
-      <w:r>
-        <w:rPr>
-          <w:sz w:val="22"/>
-        </w:rPr>
-        <w:t>Limitación: n = 200 es chico. Con otra cohorte podría haber variación,</w:t>
-      </w:r>
-    </w:p>
-    <w:p>
-      <w:r>
-        <w:rPr>
-          <w:sz w:val="22"/>
-        </w:rPr>
-        <w:t>por eso se recomienda recalibrar el umbral en cada cuatrimestre.</w:t>
+        <w:t>(las dos variables más controlables a corto plazo).</w:t>
+      </w:r>
+    </w:p>
+    <w:p>
+      <w:pPr>
+        <w:pStyle w:val="Heading1"/>
+      </w:pPr>
+      <w:r>
+        <w:rPr>
+          <w:color w:val="2C3E50"/>
+        </w:rPr>
+        <w:t>10. Nueve scores complementarios para otras decisiones</w:t>
       </w:r>
     </w:p>
     <w:p>
@@ -1363,7 +1757,7 @@
         <w:rPr>
           <w:color w:val="2C3E50"/>
         </w:rPr>
-        <w:t>Ética, sesgos y explicabilidad</w:t>
+        <w:t>Para qué sirven los 9 scores complementarios</w:t>
       </w:r>
     </w:p>
     <w:p>
@@ -1371,7 +1765,39 @@
         <w:rPr>
           <w:sz w:val="22"/>
         </w:rPr>
-        <w:t>• ¿El dataset puede contener sesgos que afecten el score?</w:t>
+        <w:t>El score de riesgo es solo un ángulo del problema. A partir del mismo dataset</w:t>
+      </w:r>
+    </w:p>
+    <w:p>
+      <w:r>
+        <w:rPr>
+          <w:sz w:val="22"/>
+        </w:rPr>
+        <w:t>podemos construir scores complementarios que apoyan distintas decisiones de la</w:t>
+      </w:r>
+    </w:p>
+    <w:p>
+      <w:r>
+        <w:rPr>
+          <w:sz w:val="22"/>
+        </w:rPr>
+        <w:t>cátedra: priorizar tutorías, reconocer trayectorias positivas, detectar</w:t>
+      </w:r>
+    </w:p>
+    <w:p>
+      <w:r>
+        <w:rPr>
+          <w:sz w:val="22"/>
+        </w:rPr>
+        <w:t>ineficiencias en la técnica de estudio, alertar sobre desbalance vida-estudio,</w:t>
+      </w:r>
+    </w:p>
+    <w:p>
+      <w:r>
+        <w:rPr>
+          <w:sz w:val="22"/>
+        </w:rPr>
+        <w:t>predecir abandono, etc.</w:t>
       </w:r>
     </w:p>
     <w:p/>
@@ -1380,7 +1806,15 @@
         <w:rPr>
           <w:sz w:val="22"/>
         </w:rPr>
-        <w:t>• ¿Cómo se podría explicar el score a una persona no técnica?</w:t>
+        <w:t>Cada score se acota a la escala 0-100. Las normalizaciones por percentil hacen</w:t>
+      </w:r>
+    </w:p>
+    <w:p>
+      <w:r>
+        <w:rPr>
+          <w:sz w:val="22"/>
+        </w:rPr>
+        <w:t>que los scores sean robustos a la escala atípica de exam_score (max ≈ 51).</w:t>
       </w:r>
     </w:p>
     <w:p/>
@@ -1389,7 +1823,48 @@
         <w:rPr>
           <w:sz w:val="22"/>
         </w:rPr>
-        <w:t>• ¿Qué controles deberían existir antes de implementarlo en producción?</w:t>
+        <w:t>Los 9 scores no son redundantes: cada uno apunta a una decisión distinta.</w:t>
+      </w:r>
+    </w:p>
+    <w:p>
+      <w:r>
+        <w:rPr>
+          <w:sz w:val="22"/>
+        </w:rPr>
+        <w:t>Pueden combinarse — por ejemplo, riesgo alto + potencial alto = prioridad máxima.</w:t>
+      </w:r>
+    </w:p>
+    <w:p/>
+    <w:p>
+      <w:r>
+        <w:rPr>
+          <w:sz w:val="22"/>
+        </w:rPr>
+        <w:t>ATENCIÓN — score_desercion es un PROXY. El dataset no tiene etiqueta real de</w:t>
+      </w:r>
+    </w:p>
+    <w:p>
+      <w:r>
+        <w:rPr>
+          <w:sz w:val="22"/>
+        </w:rPr>
+        <w:t>abandono, así que el score se construye con criterios de literatura (asistencia</w:t>
+      </w:r>
+    </w:p>
+    <w:p>
+      <w:r>
+        <w:rPr>
+          <w:sz w:val="22"/>
+        </w:rPr>
+        <w:t>como predictor más fuerte) pero NO se puede validar con AUC. Su uso debe ser</w:t>
+      </w:r>
+    </w:p>
+    <w:p>
+      <w:r>
+        <w:rPr>
+          <w:sz w:val="22"/>
+        </w:rPr>
+        <w:t>INDICATIVO, no decisorio.</w:t>
       </w:r>
     </w:p>
     <w:p>
@@ -1400,7 +1875,7 @@
         <w:rPr>
           <w:color w:val="2C3E50"/>
         </w:rPr>
-        <w:t>Respuestas — Ética, sesgos y explicabilidad</w:t>
+        <w:t>Cómo combinar varios scores para una decisión concreta</w:t>
       </w:r>
     </w:p>
     <w:p>
@@ -1408,23 +1883,25 @@
         <w:rPr>
           <w:sz w:val="22"/>
         </w:rPr>
-        <w:t>¿EL DATASET PUEDE CONTENER SESGOS QUE AFECTEN EL SCORE?</w:t>
-      </w:r>
-    </w:p>
+        <w:t>Distintos scores cuentan historias distintas del MISMO estudiante:</w:t>
+      </w:r>
+    </w:p>
+    <w:p/>
     <w:p>
       <w:r>
         <w:rPr>
           <w:sz w:val="22"/>
         </w:rPr>
-        <w:t>Sí, varios:</w:t>
-      </w:r>
-    </w:p>
+        <w:t>• riesgo alto + potencial alto         → prioridad máxima de tutoría (ROI alto)</w:t>
+      </w:r>
+    </w:p>
+    <w:p/>
     <w:p>
       <w:r>
         <w:rPr>
           <w:sz w:val="22"/>
         </w:rPr>
-        <w:t>• Variables autodeclaradas: hours_studied y sleep_hours dependen de la</w:t>
+        <w:t>• riesgo alto + engagement bajo        → primero llamado de atención por</w:t>
       </w:r>
     </w:p>
     <w:p>
@@ -1432,15 +1909,16 @@
         <w:rPr>
           <w:sz w:val="22"/>
         </w:rPr>
-        <w:t xml:space="preserve">  honestidad del estudiante (sesgo de respuesta).</w:t>
-      </w:r>
-    </w:p>
+        <w:t xml:space="preserve">                                         compromiso, antes que tutoría académica</w:t>
+      </w:r>
+    </w:p>
+    <w:p/>
     <w:p>
       <w:r>
         <w:rPr>
           <w:sz w:val="22"/>
         </w:rPr>
-        <w:t>• Sesgo de selección: solo aparecen alumnos que llegaron al examen;</w:t>
+        <w:t>• riesgo alto + eficiencia baja        → tutoría enfocada en MÉTODO de estudio,</w:t>
       </w:r>
     </w:p>
     <w:p>
@@ -1448,15 +1926,16 @@
         <w:rPr>
           <w:sz w:val="22"/>
         </w:rPr>
-        <w:t xml:space="preserve">  los que abandonaron antes no están representados.</w:t>
-      </w:r>
-    </w:p>
+        <w:t xml:space="preserve">                                         no en contenido</w:t>
+      </w:r>
+    </w:p>
+    <w:p/>
     <w:p>
       <w:r>
         <w:rPr>
           <w:sz w:val="22"/>
         </w:rPr>
-        <w:t>• Sesgo de etiquetado: si en cohortes previas hubo intervenciones,</w:t>
+        <w:t>• score_anomalia alto                  → caso atípico que requiere REVISIÓN</w:t>
       </w:r>
     </w:p>
     <w:p>
@@ -1464,7 +1943,7 @@
         <w:rPr>
           <w:sz w:val="22"/>
         </w:rPr>
-        <w:t xml:space="preserve">  el modelo aprende a sub-detectar a quienes ya recibieron ayuda.</w:t>
+        <w:t xml:space="preserve">                                         HUMANA (problema personal, ansiedad</w:t>
       </w:r>
     </w:p>
     <w:p>
@@ -1472,15 +1951,16 @@
         <w:rPr>
           <w:sz w:val="22"/>
         </w:rPr>
-        <w:t>• Variables ausentes pero relevantes: nivel socioeconómico, trabajo en</w:t>
-      </w:r>
-    </w:p>
+        <w:t xml:space="preserve">                                         de examen, error de datos)</w:t>
+      </w:r>
+    </w:p>
+    <w:p/>
     <w:p>
       <w:r>
         <w:rPr>
           <w:sz w:val="22"/>
         </w:rPr>
-        <w:t xml:space="preserve">  paralelo, distancia al campus — pueden correlacionar con las features</w:t>
+        <w:t>• score_habitos bajo                   → charla de bienestar antes que más</w:t>
       </w:r>
     </w:p>
     <w:p>
@@ -1488,7 +1968,7 @@
         <w:rPr>
           <w:sz w:val="22"/>
         </w:rPr>
-        <w:t xml:space="preserve">  e introducir sesgo indirecto.</w:t>
+        <w:t xml:space="preserve">                                         horas de estudio (riesgo de burnout)</w:t>
       </w:r>
     </w:p>
     <w:p/>
@@ -1497,7 +1977,7 @@
         <w:rPr>
           <w:sz w:val="22"/>
         </w:rPr>
-        <w:t>¿CÓMO SE PODRÍA EXPLICAR EL SCORE A UNA PERSONA NO TÉCNICA?</w:t>
+        <w:t>• score_progreso alto                  → reconocer mejora aunque la nota</w:t>
       </w:r>
     </w:p>
     <w:p>
@@ -1505,15 +1985,16 @@
         <w:rPr>
           <w:sz w:val="22"/>
         </w:rPr>
-        <w:t>Usando lenguaje natural y los valores propios del alumno:</w:t>
-      </w:r>
-    </w:p>
+        <w:t xml:space="preserve">                                         actual no sea alta — refuerza motivación</w:t>
+      </w:r>
+    </w:p>
+    <w:p/>
     <w:p>
       <w:r>
         <w:rPr>
           <w:sz w:val="22"/>
         </w:rPr>
-        <w:t xml:space="preserve">  'Tu score combina cuatro señales: cuánto estudiás (40 %), tu</w:t>
+        <w:t>• score_desercion alto                 → activar plan de retención: contacto</w:t>
       </w:r>
     </w:p>
     <w:p>
@@ -1521,7 +2002,7 @@
         <w:rPr>
           <w:sz w:val="22"/>
         </w:rPr>
-        <w:t xml:space="preserve">   trayectoria previa (30 %), tu asistencia (20 %) y tus horas de</w:t>
+        <w:t xml:space="preserve">                                         coordinador, tutor de carrera, posible</w:t>
       </w:r>
     </w:p>
     <w:p>
@@ -1529,7 +2010,7 @@
         <w:rPr>
           <w:sz w:val="22"/>
         </w:rPr>
-        <w:t xml:space="preserve">   sueño (10 %). En tu caso, estudiás X horas y asistís al Y %, eso</w:t>
+        <w:t xml:space="preserve">                                         entrevista con bienestar estudiantil.</w:t>
       </w:r>
     </w:p>
     <w:p>
@@ -1537,112 +2018,7 @@
         <w:rPr>
           <w:sz w:val="22"/>
         </w:rPr>
-        <w:t xml:space="preserve">   te ubica en nivel Z. Si aumentás horas de estudio y asistencia</w:t>
-      </w:r>
-    </w:p>
-    <w:p>
-      <w:r>
-        <w:rPr>
-          <w:sz w:val="22"/>
-        </w:rPr>
-        <w:t xml:space="preserve">   (las dos variables más controlables a corto plazo), el score baja.'</w:t>
-      </w:r>
-    </w:p>
-    <w:p>
-      <w:r>
-        <w:rPr>
-          <w:sz w:val="22"/>
-        </w:rPr>
-        <w:t>Cada estudiante debería poder pedir este detalle (derecho a la</w:t>
-      </w:r>
-    </w:p>
-    <w:p>
-      <w:r>
-        <w:rPr>
-          <w:sz w:val="22"/>
-        </w:rPr>
-        <w:t>explicación).</w:t>
-      </w:r>
-    </w:p>
-    <w:p/>
-    <w:p>
-      <w:r>
-        <w:rPr>
-          <w:sz w:val="22"/>
-        </w:rPr>
-        <w:t>¿QUÉ CONTROLES DEBERÍAN EXISTIR ANTES DE IMPLEMENTARLO?</w:t>
-      </w:r>
-    </w:p>
-    <w:p>
-      <w:r>
-        <w:rPr>
-          <w:sz w:val="22"/>
-        </w:rPr>
-        <w:t>• TÉCNICOS: validación con otra cohorte, monitoreo de drift, pruebas</w:t>
-      </w:r>
-    </w:p>
-    <w:p>
-      <w:r>
-        <w:rPr>
-          <w:sz w:val="22"/>
-        </w:rPr>
-        <w:t xml:space="preserve">  de fairness por carrera / sede / turno, recalibración periódica.</w:t>
-      </w:r>
-    </w:p>
-    <w:p>
-      <w:r>
-        <w:rPr>
-          <w:sz w:val="22"/>
-        </w:rPr>
-        <w:t>• HUMANOS: el score ASISTE, NO DECIDE — todo caso pasa por un tutor</w:t>
-      </w:r>
-    </w:p>
-    <w:p>
-      <w:r>
-        <w:rPr>
-          <w:sz w:val="22"/>
-        </w:rPr>
-        <w:t xml:space="preserve">  que puede sobrescribir el nivel. Auditoría manual de 'Crítico'.</w:t>
-      </w:r>
-    </w:p>
-    <w:p>
-      <w:r>
-        <w:rPr>
-          <w:sz w:val="22"/>
-        </w:rPr>
-        <w:t>• ÉTICOS Y NORMATIVOS: consentimiento informado, derecho a no</w:t>
-      </w:r>
-    </w:p>
-    <w:p>
-      <w:r>
-        <w:rPr>
-          <w:sz w:val="22"/>
-        </w:rPr>
-        <w:t xml:space="preserve">  participar, transparencia sobre qué variables se usan, vía formal</w:t>
-      </w:r>
-    </w:p>
-    <w:p>
-      <w:r>
-        <w:rPr>
-          <w:sz w:val="22"/>
-        </w:rPr>
-        <w:t xml:space="preserve">  para impugnar el nivel asignado.</w:t>
-      </w:r>
-    </w:p>
-    <w:p>
-      <w:r>
-        <w:rPr>
-          <w:sz w:val="22"/>
-        </w:rPr>
-        <w:t>• EXCLUSIONES EXPLÍCITAS: nunca incorporar género, edad, etnia,</w:t>
-      </w:r>
-    </w:p>
-    <w:p>
-      <w:r>
-        <w:rPr>
-          <w:sz w:val="22"/>
-        </w:rPr>
-        <w:t xml:space="preserve">  nacionalidad ni nivel socioeconómico como features.</w:t>
+        <w:t xml:space="preserve">                                         RECORDAR: es proxy, no decisión final</w:t>
       </w:r>
     </w:p>
     <w:p>
@@ -1653,7 +2029,9 @@
         <w:rPr>
           <w:color w:val="2C3E50"/>
         </w:rPr>
-        <w:t>1. Definición del problema</w:t>
+        <w:t>Cómo se calcula cada score</w:t>
+        <w:br/>
+        <w:t>(11 fórmulas — una por página)</w:t>
       </w:r>
     </w:p>
     <w:p>
@@ -1664,1261 +2042,7 @@
         <w:rPr>
           <w:color w:val="2C3E50"/>
         </w:rPr>
-        <w:t>Definición del problema</w:t>
-      </w:r>
-    </w:p>
-    <w:p>
-      <w:r>
-        <w:rPr>
-          <w:sz w:val="22"/>
-        </w:rPr>
-        <w:t>DECISIÓN A APOYAR</w:t>
-      </w:r>
-    </w:p>
-    <w:p>
-      <w:r>
-        <w:rPr>
-          <w:sz w:val="22"/>
-        </w:rPr>
-        <w:t>Detectar antes del examen final qué estudiantes tienen mayor probabilidad de bajo</w:t>
-      </w:r>
-    </w:p>
-    <w:p>
-      <w:r>
-        <w:rPr>
-          <w:sz w:val="22"/>
-        </w:rPr>
-        <w:t>desempeño, para que la cátedra pueda intervenir (tutorías, recuperatorios, seguimiento).</w:t>
-      </w:r>
-    </w:p>
-    <w:p/>
-    <w:p>
-      <w:r>
-        <w:rPr>
-          <w:sz w:val="22"/>
-        </w:rPr>
-        <w:t>UNIDAD DE ANÁLISIS</w:t>
-      </w:r>
-    </w:p>
-    <w:p>
-      <w:r>
-        <w:rPr>
-          <w:sz w:val="22"/>
-        </w:rPr>
-        <w:t>Un estudiante (1 fila = 1 estudiante = 1 score).</w:t>
-      </w:r>
-    </w:p>
-    <w:p/>
-    <w:p>
-      <w:r>
-        <w:rPr>
-          <w:sz w:val="22"/>
-        </w:rPr>
-        <w:t>QUÉ SIGNIFICA EL SCORE</w:t>
-      </w:r>
-    </w:p>
-    <w:p>
-      <w:r>
-        <w:rPr>
-          <w:sz w:val="22"/>
-        </w:rPr>
-        <w:t>Riesgo de bajo desempeño académico en el examen. Score alto = mayor riesgo (negativo).</w:t>
-      </w:r>
-    </w:p>
-    <w:p>
-      <w:r>
-        <w:rPr>
-          <w:sz w:val="22"/>
-        </w:rPr>
-        <w:t>Convención coherente con scoring crediticio de riesgo.</w:t>
-      </w:r>
-    </w:p>
-    <w:p/>
-    <w:p>
-      <w:r>
-        <w:rPr>
-          <w:sz w:val="22"/>
-        </w:rPr>
-        <w:t>QUIÉN LO USA Y CUÁNDO</w:t>
-      </w:r>
-    </w:p>
-    <w:p>
-      <w:r>
-        <w:rPr>
-          <w:sz w:val="22"/>
-        </w:rPr>
-        <w:t>Tutores, coordinador académico y docente del curso, al inicio o mitad del cuatrimestre,</w:t>
-      </w:r>
-    </w:p>
-    <w:p>
-      <w:r>
-        <w:rPr>
-          <w:sz w:val="22"/>
-        </w:rPr>
-        <w:t>ANTES del examen final. Por eso 'exam_score' no se usa como variable predictora</w:t>
-      </w:r>
-    </w:p>
-    <w:p>
-      <w:r>
-        <w:rPr>
-          <w:sz w:val="22"/>
-        </w:rPr>
-        <w:t>(sería data leakage: la decisión la tomamos antes de conocer la nota).</w:t>
-      </w:r>
-    </w:p>
-    <w:p/>
-    <w:p>
-      <w:r>
-        <w:rPr>
-          <w:sz w:val="22"/>
-        </w:rPr>
-        <w:t>SCORING vs CLASIFICACIÓN vs PREDICCIÓN</w:t>
-      </w:r>
-    </w:p>
-    <w:p>
-      <w:r>
-        <w:rPr>
-          <w:sz w:val="22"/>
-        </w:rPr>
-        <w:t>• Predicción: estima el valor de exam_score (regresión).</w:t>
-      </w:r>
-    </w:p>
-    <w:p>
-      <w:r>
-        <w:rPr>
-          <w:sz w:val="22"/>
-        </w:rPr>
-        <w:t>• Clasificación: asigna 0 o 1 (¿desaprobará o no?).</w:t>
-      </w:r>
-    </w:p>
-    <w:p>
-      <w:r>
-        <w:rPr>
-          <w:sz w:val="22"/>
-        </w:rPr>
-        <w:t>• Scoring: ordena a los estudiantes en 0-100 para priorizar intervenciones.</w:t>
-      </w:r>
-    </w:p>
-    <w:p>
-      <w:pPr>
-        <w:pStyle w:val="Heading1"/>
-      </w:pPr>
-      <w:r>
-        <w:rPr>
-          <w:color w:val="2C3E50"/>
-        </w:rPr>
-        <w:t>2. Exploración del dataset</w:t>
-      </w:r>
-    </w:p>
-    <w:p>
-      <w:pPr>
-        <w:pStyle w:val="Heading2"/>
-      </w:pPr>
-      <w:r>
-        <w:rPr>
-          <w:color w:val="2C3E50"/>
-        </w:rPr>
-        <w:t>Hallazgos del EDA</w:t>
-      </w:r>
-    </w:p>
-    <w:p>
-      <w:r>
-        <w:rPr>
-          <w:sz w:val="22"/>
-        </w:rPr>
-        <w:t>• 200 estudiantes, sin nulos ni duplicados → no requiere imputación.</w:t>
-      </w:r>
-    </w:p>
-    <w:p/>
-    <w:p>
-      <w:r>
-        <w:rPr>
-          <w:sz w:val="22"/>
-        </w:rPr>
-        <w:t>• exam_score va de 17.1 a 51.3 —</w:t>
-      </w:r>
-    </w:p>
-    <w:p>
-      <w:r>
-        <w:rPr>
-          <w:sz w:val="22"/>
-        </w:rPr>
-        <w:t xml:space="preserve">  no es un 0-100 clásico. Por eso no aplica el umbral de 60 del enunciado:</w:t>
-      </w:r>
-    </w:p>
-    <w:p>
-      <w:r>
-        <w:rPr>
-          <w:sz w:val="22"/>
-        </w:rPr>
-        <w:t xml:space="preserve">  dejaría al 100% de los estudiantes como 'riesgo'.</w:t>
-      </w:r>
-    </w:p>
-    <w:p/>
-    <w:p>
-      <w:r>
-        <w:rPr>
-          <w:sz w:val="22"/>
-        </w:rPr>
-        <w:t>• previous_scores está en escala 40-95 (parece promedio académico previo 0-100).</w:t>
-      </w:r>
-    </w:p>
-    <w:p/>
-    <w:p>
-      <w:r>
-        <w:rPr>
-          <w:sz w:val="22"/>
-        </w:rPr>
-        <w:t>• hours_studied, sleep_hours y attendance_percent están en rangos plausibles.</w:t>
-      </w:r>
-    </w:p>
-    <w:p/>
-    <w:p>
-      <w:r>
-        <w:rPr>
-          <w:sz w:val="22"/>
-        </w:rPr>
-        <w:t>• Predictor más fuerte: hours_studied (r = 0.78 con exam_score).</w:t>
-      </w:r>
-    </w:p>
-    <w:p>
-      <w:r>
-        <w:rPr>
-          <w:sz w:val="22"/>
-        </w:rPr>
-        <w:t xml:space="preserve">  Le sigue previous_scores (r = 0.43), después attendance (0.23) y sleep_hours (0.19).</w:t>
-      </w:r>
-    </w:p>
-    <w:p>
-      <w:pPr>
-        <w:pStyle w:val="Heading1"/>
-      </w:pPr>
-      <w:r>
-        <w:rPr>
-          <w:color w:val="2C3E50"/>
-        </w:rPr>
-        <w:t>3. Variable objetivo</w:t>
-      </w:r>
-    </w:p>
-    <w:p>
-      <w:pPr>
-        <w:pStyle w:val="Heading2"/>
-      </w:pPr>
-      <w:r>
-        <w:rPr>
-          <w:color w:val="2C3E50"/>
-        </w:rPr>
-        <w:t>Definición de riesgo_bajo_desempeno</w:t>
-      </w:r>
-    </w:p>
-    <w:p>
-      <w:r>
-        <w:rPr>
-          <w:sz w:val="22"/>
-        </w:rPr>
-        <w:t>DECISIÓN</w:t>
-      </w:r>
-    </w:p>
-    <w:p>
-      <w:r>
-        <w:rPr>
-          <w:sz w:val="22"/>
-        </w:rPr>
-        <w:t>Como exam_score no está en escala 0-100 estándar, el umbral se define</w:t>
-      </w:r>
-    </w:p>
-    <w:p>
-      <w:r>
-        <w:rPr>
-          <w:sz w:val="22"/>
-        </w:rPr>
-        <w:t>usando el cuartil inferior de la propia distribución: el 25 % de estudiantes</w:t>
-      </w:r>
-    </w:p>
-    <w:p>
-      <w:r>
-        <w:rPr>
-          <w:sz w:val="22"/>
-        </w:rPr>
-        <w:t>con peor nota se considera 'bajo desempeño'.</w:t>
-      </w:r>
-    </w:p>
-    <w:p/>
-    <w:p>
-      <w:r>
-        <w:rPr>
-          <w:sz w:val="22"/>
-        </w:rPr>
-        <w:t>REGLA</w:t>
-      </w:r>
-    </w:p>
-    <w:p>
-      <w:r>
-        <w:rPr>
-          <w:sz w:val="22"/>
-        </w:rPr>
-        <w:t xml:space="preserve">  riesgo_bajo_desempeno = 1   si exam_score &lt; 29.50</w:t>
-      </w:r>
-    </w:p>
-    <w:p>
-      <w:r>
-        <w:rPr>
-          <w:sz w:val="22"/>
-        </w:rPr>
-        <w:t xml:space="preserve">  riesgo_bajo_desempeno = 0   en caso contrario</w:t>
-      </w:r>
-    </w:p>
-    <w:p/>
-    <w:p>
-      <w:r>
-        <w:rPr>
-          <w:sz w:val="22"/>
-        </w:rPr>
-        <w:t>DISTRIBUCIÓN OBSERVADA</w:t>
-      </w:r>
-    </w:p>
-    <w:p>
-      <w:r>
-        <w:rPr>
-          <w:sz w:val="22"/>
-        </w:rPr>
-        <w:t xml:space="preserve">  • Clase 0 (sin riesgo): 75.5 %</w:t>
-      </w:r>
-    </w:p>
-    <w:p>
-      <w:r>
-        <w:rPr>
-          <w:sz w:val="22"/>
-        </w:rPr>
-        <w:t xml:space="preserve">  • Clase 1 (riesgo):     24.5 %</w:t>
-      </w:r>
-    </w:p>
-    <w:p/>
-    <w:p>
-      <w:r>
-        <w:rPr>
-          <w:sz w:val="22"/>
-        </w:rPr>
-        <w:t>Es un criterio relativo, transparente y reproducible. En otra cohorte habría</w:t>
-      </w:r>
-    </w:p>
-    <w:p>
-      <w:r>
-        <w:rPr>
-          <w:sz w:val="22"/>
-        </w:rPr>
-        <w:t>que recalibrar el umbral.</w:t>
-      </w:r>
-    </w:p>
-    <w:p>
-      <w:pPr>
-        <w:pStyle w:val="Heading1"/>
-      </w:pPr>
-      <w:r>
-        <w:rPr>
-          <w:color w:val="2C3E50"/>
-        </w:rPr>
-        <w:t>4. Scoring por reglas</w:t>
-      </w:r>
-    </w:p>
-    <w:p>
-      <w:pPr>
-        <w:pStyle w:val="Heading1"/>
-      </w:pPr>
-      <w:r>
-        <w:rPr>
-          <w:color w:val="2C3E50"/>
-        </w:rPr>
-        <w:t>5. Niveles de riesgo y acciones</w:t>
-      </w:r>
-    </w:p>
-    <w:p>
-      <w:pPr>
-        <w:pStyle w:val="Heading2"/>
-      </w:pPr>
-      <w:r>
-        <w:rPr>
-          <w:color w:val="2C3E50"/>
-        </w:rPr>
-        <w:t>Lectura de la validación</w:t>
-      </w:r>
-    </w:p>
-    <w:p>
-      <w:r>
-        <w:rPr>
-          <w:sz w:val="22"/>
-        </w:rPr>
-        <w:t>Si el score por reglas funciona, la 'tasa de bajo desempeño' debe crecer</w:t>
-      </w:r>
-    </w:p>
-    <w:p>
-      <w:r>
-        <w:rPr>
-          <w:sz w:val="22"/>
-        </w:rPr>
-        <w:t>monotónicamente del nivel Bajo al Crítico. Es lo que se observa:</w:t>
-      </w:r>
-    </w:p>
-    <w:p/>
-    <w:p>
-      <w:r>
-        <w:rPr>
-          <w:sz w:val="22"/>
-        </w:rPr>
-        <w:t xml:space="preserve">  Bajo    →   0.0 % de los estudiantes desaprueba</w:t>
-      </w:r>
-    </w:p>
-    <w:p>
-      <w:r>
-        <w:rPr>
-          <w:sz w:val="22"/>
-        </w:rPr>
-        <w:t xml:space="preserve">  Medio   →   1.5 %</w:t>
-      </w:r>
-    </w:p>
-    <w:p>
-      <w:r>
-        <w:rPr>
-          <w:sz w:val="22"/>
-        </w:rPr>
-        <w:t xml:space="preserve">  Alto    →  34.4 %</w:t>
-      </w:r>
-    </w:p>
-    <w:p>
-      <w:r>
-        <w:rPr>
-          <w:sz w:val="22"/>
-        </w:rPr>
-        <w:t xml:space="preserve">  Crítico →  84.4 %</w:t>
-      </w:r>
-    </w:p>
-    <w:p/>
-    <w:p>
-      <w:r>
-        <w:rPr>
-          <w:sz w:val="22"/>
-        </w:rPr>
-        <w:t>El salto entre Alto y Crítico es la señal más fuerte: el score por reglas</w:t>
-      </w:r>
-    </w:p>
-    <w:p>
-      <w:r>
-        <w:rPr>
-          <w:sz w:val="22"/>
-        </w:rPr>
-        <w:t>logra concentrar el riesgo real en el extremo superior de la escala.</w:t>
-      </w:r>
-    </w:p>
-    <w:p>
-      <w:pPr>
-        <w:pStyle w:val="Heading1"/>
-      </w:pPr>
-      <w:r>
-        <w:rPr>
-          <w:color w:val="2C3E50"/>
-        </w:rPr>
-        <w:t>6. Modelo predictivo (scikit-learn)</w:t>
-      </w:r>
-    </w:p>
-    <w:p>
-      <w:pPr>
-        <w:pStyle w:val="Heading2"/>
-      </w:pPr>
-      <w:r>
-        <w:rPr>
-          <w:color w:val="2C3E50"/>
-        </w:rPr>
-        <w:t>Decisiones de modelado</w:t>
-      </w:r>
-    </w:p>
-    <w:p>
-      <w:r>
-        <w:rPr>
-          <w:sz w:val="22"/>
-        </w:rPr>
-        <w:t>TIPO DE PROBLEMA</w:t>
-      </w:r>
-    </w:p>
-    <w:p>
-      <w:r>
-        <w:rPr>
-          <w:sz w:val="22"/>
-        </w:rPr>
-        <w:t>Clasificación binaria (riesgo / no riesgo). El usuario final necesita decidir</w:t>
-      </w:r>
-    </w:p>
-    <w:p>
-      <w:r>
-        <w:rPr>
-          <w:sz w:val="22"/>
-        </w:rPr>
-        <w:t>intervenir o no — output operativo, no estimar la nota exacta.</w:t>
-      </w:r>
-    </w:p>
-    <w:p/>
-    <w:p>
-      <w:r>
-        <w:rPr>
-          <w:sz w:val="22"/>
-        </w:rPr>
-        <w:t>VARIABLES PREDICTORAS</w:t>
-      </w:r>
-    </w:p>
-    <w:p>
-      <w:r>
-        <w:rPr>
-          <w:sz w:val="22"/>
-        </w:rPr>
-        <w:t>hours_studied, sleep_hours, attendance_percent, previous_scores.</w:t>
-      </w:r>
-    </w:p>
-    <w:p>
-      <w:r>
-        <w:rPr>
-          <w:sz w:val="22"/>
-        </w:rPr>
-        <w:t>Disponibles ANTES del examen final. exam_score se excluye (data leakage).</w:t>
-      </w:r>
-    </w:p>
-    <w:p/>
-    <w:p>
-      <w:r>
-        <w:rPr>
-          <w:sz w:val="22"/>
-        </w:rPr>
-        <w:t>MODELOS COMPARADOS</w:t>
-      </w:r>
-    </w:p>
-    <w:p>
-      <w:r>
-        <w:rPr>
-          <w:sz w:val="22"/>
-        </w:rPr>
-        <w:t>• Logistic Regression: interpretable, rápido, baseline.</w:t>
-      </w:r>
-    </w:p>
-    <w:p>
-      <w:r>
-        <w:rPr>
-          <w:sz w:val="22"/>
-        </w:rPr>
-        <w:t>• Random Forest: capta no-linealidades, robusto a outliers.</w:t>
-      </w:r>
-    </w:p>
-    <w:p>
-      <w:r>
-        <w:rPr>
-          <w:sz w:val="22"/>
-        </w:rPr>
-        <w:t>Se elige el de mejor AUC en validación cruzada (5 folds).</w:t>
-      </w:r>
-    </w:p>
-    <w:p/>
-    <w:p>
-      <w:r>
-        <w:rPr>
-          <w:sz w:val="22"/>
-        </w:rPr>
-        <w:t>OTRAS DECISIONES</w:t>
-      </w:r>
-    </w:p>
-    <w:p>
-      <w:r>
-        <w:rPr>
-          <w:sz w:val="22"/>
-        </w:rPr>
-        <w:t>• train/test estratificado (clase positiva ≈ 25 %).</w:t>
-      </w:r>
-    </w:p>
-    <w:p>
-      <w:r>
-        <w:rPr>
-          <w:sz w:val="22"/>
-        </w:rPr>
-        <w:t>• StandardScaler en LR (sensible a escalas).</w:t>
-      </w:r>
-    </w:p>
-    <w:p>
-      <w:r>
-        <w:rPr>
-          <w:sz w:val="22"/>
-        </w:rPr>
-        <w:t>• Random state = 42 para reproducibilidad.</w:t>
-      </w:r>
-    </w:p>
-    <w:p>
-      <w:pPr>
-        <w:pStyle w:val="Heading1"/>
-      </w:pPr>
-      <w:r>
-        <w:rPr>
-          <w:color w:val="2C3E50"/>
-        </w:rPr>
-        <w:t>7. Comparación reglas vs modelo</w:t>
-      </w:r>
-    </w:p>
-    <w:p>
-      <w:pPr>
-        <w:pStyle w:val="Heading1"/>
-      </w:pPr>
-      <w:r>
-        <w:rPr>
-          <w:color w:val="2C3E50"/>
-        </w:rPr>
-        <w:t>8. Evaluación con métricas</w:t>
-      </w:r>
-    </w:p>
-    <w:p>
-      <w:pPr>
-        <w:pStyle w:val="Heading2"/>
-      </w:pPr>
-      <w:r>
-        <w:rPr>
-          <w:color w:val="2C3E50"/>
-        </w:rPr>
-        <w:t>Falso positivo vs falso negativo</w:t>
-      </w:r>
-    </w:p>
-    <w:p>
-      <w:r>
-        <w:rPr>
-          <w:sz w:val="22"/>
-        </w:rPr>
-        <w:t>EN ESTE PROBLEMA, EL FALSO NEGATIVO ES MÁS GRAVE</w:t>
-      </w:r>
-    </w:p>
-    <w:p/>
-    <w:p>
-      <w:r>
-        <w:rPr>
-          <w:sz w:val="22"/>
-        </w:rPr>
-        <w:t>• FALSO NEGATIVO: el score dice 'sin riesgo' pero el estudiante desaprueba.</w:t>
-      </w:r>
-    </w:p>
-    <w:p>
-      <w:r>
-        <w:rPr>
-          <w:sz w:val="22"/>
-        </w:rPr>
-        <w:t xml:space="preserve">  Costo: no recibió la intervención y termina desaprobando.</w:t>
-      </w:r>
-    </w:p>
-    <w:p/>
-    <w:p>
-      <w:r>
-        <w:rPr>
-          <w:sz w:val="22"/>
-        </w:rPr>
-        <w:t>• FALSO POSITIVO: el score dice 'riesgo' pero el estudiante aprueba.</w:t>
-      </w:r>
-    </w:p>
-    <w:p>
-      <w:r>
-        <w:rPr>
-          <w:sz w:val="22"/>
-        </w:rPr>
-        <w:t xml:space="preserve">  Costo: una entrevista innecesaria del tutor.</w:t>
-      </w:r>
-    </w:p>
-    <w:p/>
-    <w:p>
-      <w:r>
-        <w:rPr>
-          <w:sz w:val="22"/>
-        </w:rPr>
-        <w:t>→ Priorizamos RECALL sobre la clase positiva (riesgo). Para un score operativo,</w:t>
-      </w:r>
-    </w:p>
-    <w:p>
-      <w:r>
-        <w:rPr>
-          <w:sz w:val="22"/>
-        </w:rPr>
-        <w:t>fijamos un umbral que capture al menos el 70-80 % de los casos positivos.</w:t>
-      </w:r>
-    </w:p>
-    <w:p>
-      <w:pPr>
-        <w:pStyle w:val="Heading2"/>
-      </w:pPr>
-      <w:r>
-        <w:rPr>
-          <w:color w:val="2C3E50"/>
-        </w:rPr>
-        <w:t>Lectura de la matriz de confusión</w:t>
-      </w:r>
-    </w:p>
-    <w:p>
-      <w:r>
-        <w:rPr>
-          <w:sz w:val="22"/>
-        </w:rPr>
-        <w:t>En el set de test (n = 60) y con umbral operativo 50:</w:t>
-      </w:r>
-    </w:p>
-    <w:p/>
-    <w:p>
-      <w:r>
-        <w:rPr>
-          <w:sz w:val="22"/>
-        </w:rPr>
-        <w:t xml:space="preserve">  → De 15 estudiantes con riesgo real, el modelo detectó 12</w:t>
-      </w:r>
-    </w:p>
-    <w:p>
-      <w:r>
-        <w:rPr>
-          <w:sz w:val="22"/>
-        </w:rPr>
-        <w:t xml:space="preserve">    y dejó pasar 3  (recall = 80%).</w:t>
-      </w:r>
-    </w:p>
-    <w:p/>
-    <w:p>
-      <w:r>
-        <w:rPr>
-          <w:sz w:val="22"/>
-        </w:rPr>
-        <w:t xml:space="preserve">  → De 45 estudiantes sin riesgo, el modelo clasificó bien 44</w:t>
-      </w:r>
-    </w:p>
-    <w:p>
-      <w:r>
-        <w:rPr>
-          <w:sz w:val="22"/>
-        </w:rPr>
-        <w:t xml:space="preserve">    y marcó 1 como riesgo erróneamente  (specificity = 98%).</w:t>
-      </w:r>
-    </w:p>
-    <w:p/>
-    <w:p>
-      <w:r>
-        <w:rPr>
-          <w:sz w:val="22"/>
-        </w:rPr>
-        <w:t xml:space="preserve">  → De los 13 alumnos que el modelo señaló como en riesgo,</w:t>
-      </w:r>
-    </w:p>
-    <w:p>
-      <w:r>
-        <w:rPr>
-          <w:sz w:val="22"/>
-        </w:rPr>
-        <w:t xml:space="preserve">    12 efectivamente lo estaban  (precision = 92%).</w:t>
-      </w:r>
-    </w:p>
-    <w:p/>
-    <w:p>
-      <w:r>
-        <w:rPr>
-          <w:sz w:val="22"/>
-        </w:rPr>
-        <w:t>INTERPRETACIÓN OPERATIVA</w:t>
-      </w:r>
-    </w:p>
-    <w:p/>
-    <w:p>
-      <w:r>
-        <w:rPr>
-          <w:sz w:val="22"/>
-        </w:rPr>
-        <w:t>• Falsos negativos = 3  ← son los más graves: el sistema dice 'no</w:t>
-      </w:r>
-    </w:p>
-    <w:p>
-      <w:r>
-        <w:rPr>
-          <w:sz w:val="22"/>
-        </w:rPr>
-        <w:t xml:space="preserve">  hace falta intervenir' y el alumno termina desaprobando. Cada FN</w:t>
-      </w:r>
-    </w:p>
-    <w:p>
-      <w:r>
-        <w:rPr>
-          <w:sz w:val="22"/>
-        </w:rPr>
-        <w:t xml:space="preserve">  representa una oportunidad perdida de ayudar.</w:t>
-      </w:r>
-    </w:p>
-    <w:p/>
-    <w:p>
-      <w:r>
-        <w:rPr>
-          <w:sz w:val="22"/>
-        </w:rPr>
-        <w:t>• Falsos positivos = 1  ← son tolerables: solo cuestan una entrevista</w:t>
-      </w:r>
-    </w:p>
-    <w:p>
-      <w:r>
-        <w:rPr>
-          <w:sz w:val="22"/>
-        </w:rPr>
-        <w:t xml:space="preserve">  innecesaria con el tutor.</w:t>
-      </w:r>
-    </w:p>
-    <w:p/>
-    <w:p>
-      <w:r>
-        <w:rPr>
-          <w:sz w:val="22"/>
-        </w:rPr>
-        <w:t>• Si la cátedra tuviera capacidad para más casos, podría bajar el</w:t>
-      </w:r>
-    </w:p>
-    <w:p>
-      <w:r>
-        <w:rPr>
-          <w:sz w:val="22"/>
-        </w:rPr>
-        <w:t xml:space="preserve">  umbral (ej. a 40) y subir recall a costa de algo de precision.</w:t>
-      </w:r>
-    </w:p>
-    <w:p>
-      <w:r>
-        <w:rPr>
-          <w:sz w:val="22"/>
-        </w:rPr>
-        <w:t xml:space="preserve">  Si la capacidad fuera muy escasa, subir el umbral (ej. a 60) elevaría</w:t>
-      </w:r>
-    </w:p>
-    <w:p>
-      <w:r>
-        <w:rPr>
-          <w:sz w:val="22"/>
-        </w:rPr>
-        <w:t xml:space="preserve">  precision pero dejaría más alumnos en riesgo sin ayuda.</w:t>
-      </w:r>
-    </w:p>
-    <w:p/>
-    <w:p>
-      <w:r>
-        <w:rPr>
-          <w:sz w:val="22"/>
-        </w:rPr>
-        <w:t>La tabla de la próxima página muestra esa misma matriz pero a 4 umbrales,</w:t>
-      </w:r>
-    </w:p>
-    <w:p>
-      <w:r>
-        <w:rPr>
-          <w:sz w:val="22"/>
-        </w:rPr>
-        <w:t>para apoyar la decisión del corte operativo.</w:t>
-      </w:r>
-    </w:p>
-    <w:p>
-      <w:pPr>
-        <w:pStyle w:val="Heading1"/>
-      </w:pPr>
-      <w:r>
-        <w:rPr>
-          <w:color w:val="2C3E50"/>
-        </w:rPr>
-        <w:t>9. Casos individuales</w:t>
-      </w:r>
-    </w:p>
-    <w:p>
-      <w:pPr>
-        <w:pStyle w:val="Heading2"/>
-      </w:pPr>
-      <w:r>
-        <w:rPr>
-          <w:color w:val="2C3E50"/>
-        </w:rPr>
-        <w:t>Cómo se explica el score a un usuario no técnico</w:t>
-      </w:r>
-    </w:p>
-    <w:p>
-      <w:r>
-        <w:rPr>
-          <w:sz w:val="22"/>
-        </w:rPr>
-        <w:t>EJEMPLO — caso crítico</w:t>
-      </w:r>
-    </w:p>
-    <w:p/>
-    <w:p>
-      <w:r>
-        <w:rPr>
-          <w:sz w:val="22"/>
-        </w:rPr>
-        <w:t>Estudiante S125 recibió un score alto porque combina:</w:t>
-      </w:r>
-    </w:p>
-    <w:p>
-      <w:r>
-        <w:rPr>
-          <w:sz w:val="22"/>
-        </w:rPr>
-        <w:t xml:space="preserve">  • 1.0 horas de estudio (rango bajo: ≤ 2 hs)</w:t>
-      </w:r>
-    </w:p>
-    <w:p>
-      <w:r>
-        <w:rPr>
-          <w:sz w:val="22"/>
-        </w:rPr>
-        <w:t xml:space="preserve">  • 54 en desempeño previo (rango bajo: ≤ 50)</w:t>
-      </w:r>
-    </w:p>
-    <w:p>
-      <w:r>
-        <w:rPr>
-          <w:sz w:val="22"/>
-        </w:rPr>
-        <w:t xml:space="preserve">  • 82.6 % de asistencia</w:t>
-      </w:r>
-    </w:p>
-    <w:p>
-      <w:r>
-        <w:rPr>
-          <w:sz w:val="22"/>
-        </w:rPr>
-        <w:t xml:space="preserve">  • 4.1 horas promedio de sueño</w:t>
-      </w:r>
-    </w:p>
-    <w:p/>
-    <w:p>
-      <w:r>
-        <w:rPr>
-          <w:sz w:val="22"/>
-        </w:rPr>
-        <w:t>Las variables apuntan en la misma dirección, por eso el score lo ubica en el</w:t>
-      </w:r>
-    </w:p>
-    <w:p>
-      <w:r>
-        <w:rPr>
-          <w:sz w:val="22"/>
-        </w:rPr>
-        <w:t>nivel crítico y se recomienda tutoría obligatoria con seguimiento semanal.</w:t>
-      </w:r>
-    </w:p>
-    <w:p/>
-    <w:p>
-      <w:r>
-        <w:rPr>
-          <w:sz w:val="22"/>
-        </w:rPr>
-        <w:t>El estudiante puede 'mejorar' su score aumentando horas de estudio y asistencia</w:t>
-      </w:r>
-    </w:p>
-    <w:p>
-      <w:r>
-        <w:rPr>
-          <w:sz w:val="22"/>
-        </w:rPr>
-        <w:t>(las dos variables más controlables a corto plazo).</w:t>
-      </w:r>
-    </w:p>
-    <w:p>
-      <w:pPr>
-        <w:pStyle w:val="Heading1"/>
-      </w:pPr>
-      <w:r>
-        <w:rPr>
-          <w:color w:val="2C3E50"/>
-        </w:rPr>
-        <w:t>10. Scores adicionales derivados</w:t>
-      </w:r>
-    </w:p>
-    <w:p>
-      <w:pPr>
-        <w:pStyle w:val="Heading2"/>
-      </w:pPr>
-      <w:r>
-        <w:rPr>
-          <w:color w:val="2C3E50"/>
-        </w:rPr>
-        <w:t>Por qué más de un score</w:t>
-      </w:r>
-    </w:p>
-    <w:p>
-      <w:r>
-        <w:rPr>
-          <w:sz w:val="22"/>
-        </w:rPr>
-        <w:t>El score de riesgo es solo un ángulo del problema. A partir del mismo dataset</w:t>
-      </w:r>
-    </w:p>
-    <w:p>
-      <w:r>
-        <w:rPr>
-          <w:sz w:val="22"/>
-        </w:rPr>
-        <w:t>podemos construir scores complementarios que apoyan distintas decisiones de la</w:t>
-      </w:r>
-    </w:p>
-    <w:p>
-      <w:r>
-        <w:rPr>
-          <w:sz w:val="22"/>
-        </w:rPr>
-        <w:t>cátedra: priorizar tutorías, reconocer trayectorias positivas, detectar</w:t>
-      </w:r>
-    </w:p>
-    <w:p>
-      <w:r>
-        <w:rPr>
-          <w:sz w:val="22"/>
-        </w:rPr>
-        <w:t>ineficiencias en la técnica de estudio, alertar sobre desbalance vida-estudio,</w:t>
-      </w:r>
-    </w:p>
-    <w:p>
-      <w:r>
-        <w:rPr>
-          <w:sz w:val="22"/>
-        </w:rPr>
-        <w:t>predecir abandono, etc.</w:t>
-      </w:r>
-    </w:p>
-    <w:p/>
-    <w:p>
-      <w:r>
-        <w:rPr>
-          <w:sz w:val="22"/>
-        </w:rPr>
-        <w:t>Cada score se acota a la escala 0-100. Las normalizaciones por percentil hacen</w:t>
-      </w:r>
-    </w:p>
-    <w:p>
-      <w:r>
-        <w:rPr>
-          <w:sz w:val="22"/>
-        </w:rPr>
-        <w:t>que los scores sean robustos a la escala atípica de exam_score (max ≈ 51).</w:t>
-      </w:r>
-    </w:p>
-    <w:p/>
-    <w:p>
-      <w:r>
-        <w:rPr>
-          <w:sz w:val="22"/>
-        </w:rPr>
-        <w:t>Los 9 scores no son redundantes: cada uno apunta a una decisión distinta.</w:t>
-      </w:r>
-    </w:p>
-    <w:p>
-      <w:r>
-        <w:rPr>
-          <w:sz w:val="22"/>
-        </w:rPr>
-        <w:t>Pueden combinarse — por ejemplo, riesgo alto + potencial alto = prioridad máxima.</w:t>
-      </w:r>
-    </w:p>
-    <w:p/>
-    <w:p>
-      <w:r>
-        <w:rPr>
-          <w:sz w:val="22"/>
-        </w:rPr>
-        <w:t>ATENCIÓN — score_desercion es un PROXY. El dataset no tiene etiqueta real de</w:t>
-      </w:r>
-    </w:p>
-    <w:p>
-      <w:r>
-        <w:rPr>
-          <w:sz w:val="22"/>
-        </w:rPr>
-        <w:t>abandono, así que el score se construye con criterios de literatura (asistencia</w:t>
-      </w:r>
-    </w:p>
-    <w:p>
-      <w:r>
-        <w:rPr>
-          <w:sz w:val="22"/>
-        </w:rPr>
-        <w:t>como predictor más fuerte) pero NO se puede validar con AUC. Su uso debe ser</w:t>
-      </w:r>
-    </w:p>
-    <w:p>
-      <w:r>
-        <w:rPr>
-          <w:sz w:val="22"/>
-        </w:rPr>
-        <w:t>INDICATIVO, no decisorio.</w:t>
-      </w:r>
-    </w:p>
-    <w:p>
-      <w:pPr>
-        <w:pStyle w:val="Heading2"/>
-      </w:pPr>
-      <w:r>
-        <w:rPr>
-          <w:color w:val="2C3E50"/>
-        </w:rPr>
-        <w:t>Cómo combinar los scores en una decisión</w:t>
-      </w:r>
-    </w:p>
-    <w:p>
-      <w:r>
-        <w:rPr>
-          <w:sz w:val="22"/>
-        </w:rPr>
-        <w:t>Distintos scores cuentan historias distintas del MISMO estudiante:</w:t>
-      </w:r>
-    </w:p>
-    <w:p/>
-    <w:p>
-      <w:r>
-        <w:rPr>
-          <w:sz w:val="22"/>
-        </w:rPr>
-        <w:t>• riesgo alto + potencial alto         → prioridad máxima de tutoría (ROI alto)</w:t>
-      </w:r>
-    </w:p>
-    <w:p/>
-    <w:p>
-      <w:r>
-        <w:rPr>
-          <w:sz w:val="22"/>
-        </w:rPr>
-        <w:t>• riesgo alto + engagement bajo        → primero llamado de atención por</w:t>
-      </w:r>
-    </w:p>
-    <w:p>
-      <w:r>
-        <w:rPr>
-          <w:sz w:val="22"/>
-        </w:rPr>
-        <w:t xml:space="preserve">                                         compromiso, antes que tutoría académica</w:t>
-      </w:r>
-    </w:p>
-    <w:p/>
-    <w:p>
-      <w:r>
-        <w:rPr>
-          <w:sz w:val="22"/>
-        </w:rPr>
-        <w:t>• riesgo alto + eficiencia baja        → tutoría enfocada en MÉTODO de estudio,</w:t>
-      </w:r>
-    </w:p>
-    <w:p>
-      <w:r>
-        <w:rPr>
-          <w:sz w:val="22"/>
-        </w:rPr>
-        <w:t xml:space="preserve">                                         no en contenido</w:t>
-      </w:r>
-    </w:p>
-    <w:p/>
-    <w:p>
-      <w:r>
-        <w:rPr>
-          <w:sz w:val="22"/>
-        </w:rPr>
-        <w:t>• score_anomalia alto                  → caso atípico que requiere REVISIÓN</w:t>
-      </w:r>
-    </w:p>
-    <w:p>
-      <w:r>
-        <w:rPr>
-          <w:sz w:val="22"/>
-        </w:rPr>
-        <w:t xml:space="preserve">                                         HUMANA (problema personal, ansiedad</w:t>
-      </w:r>
-    </w:p>
-    <w:p>
-      <w:r>
-        <w:rPr>
-          <w:sz w:val="22"/>
-        </w:rPr>
-        <w:t xml:space="preserve">                                         de examen, error de datos)</w:t>
-      </w:r>
-    </w:p>
-    <w:p/>
-    <w:p>
-      <w:r>
-        <w:rPr>
-          <w:sz w:val="22"/>
-        </w:rPr>
-        <w:t>• score_habitos bajo                   → charla de bienestar antes que más</w:t>
-      </w:r>
-    </w:p>
-    <w:p>
-      <w:r>
-        <w:rPr>
-          <w:sz w:val="22"/>
-        </w:rPr>
-        <w:t xml:space="preserve">                                         horas de estudio (riesgo de burnout)</w:t>
-      </w:r>
-    </w:p>
-    <w:p/>
-    <w:p>
-      <w:r>
-        <w:rPr>
-          <w:sz w:val="22"/>
-        </w:rPr>
-        <w:t>• score_progreso alto                  → reconocer mejora aunque la nota</w:t>
-      </w:r>
-    </w:p>
-    <w:p>
-      <w:r>
-        <w:rPr>
-          <w:sz w:val="22"/>
-        </w:rPr>
-        <w:t xml:space="preserve">                                         actual no sea alta — refuerza motivación</w:t>
-      </w:r>
-    </w:p>
-    <w:p/>
-    <w:p>
-      <w:r>
-        <w:rPr>
-          <w:sz w:val="22"/>
-        </w:rPr>
-        <w:t>• score_desercion alto                 → activar plan de retención: contacto</w:t>
-      </w:r>
-    </w:p>
-    <w:p>
-      <w:r>
-        <w:rPr>
-          <w:sz w:val="22"/>
-        </w:rPr>
-        <w:t xml:space="preserve">                                         coordinador, tutor de carrera, posible</w:t>
-      </w:r>
-    </w:p>
-    <w:p>
-      <w:r>
-        <w:rPr>
-          <w:sz w:val="22"/>
-        </w:rPr>
-        <w:t xml:space="preserve">                                         entrevista con bienestar estudiantil.</w:t>
-      </w:r>
-    </w:p>
-    <w:p>
-      <w:r>
-        <w:rPr>
-          <w:sz w:val="22"/>
-        </w:rPr>
-        <w:t xml:space="preserve">                                         RECORDAR: es proxy, no decisión final</w:t>
-      </w:r>
-    </w:p>
-    <w:p>
-      <w:pPr>
-        <w:pStyle w:val="Heading1"/>
-      </w:pPr>
-      <w:r>
-        <w:rPr>
-          <w:color w:val="2C3E50"/>
-        </w:rPr>
-        <w:t>Cómo se calcula cada score</w:t>
-        <w:br/>
-        <w:t>(11 fórmulas — una por página)</w:t>
-      </w:r>
-    </w:p>
-    <w:p>
-      <w:pPr>
-        <w:pStyle w:val="Heading2"/>
-      </w:pPr>
-      <w:r>
-        <w:rPr>
-          <w:color w:val="2C3E50"/>
-        </w:rPr>
-        <w:t>Notación común a todas las fórmulas</w:t>
+        <w:t>Helpers y notación usados en las fórmulas</w:t>
       </w:r>
     </w:p>
     <w:p>

</xml_diff>